<commit_message>
IND Bo3/Bo5/Bo7: podmiana szablonow (kosmetyka pierwszej kolumny IMIONA przez usera)
</commit_message>
<xml_diff>
--- a/IND_Bo5.docx
+++ b/IND_Bo5.docx
@@ -269,6 +269,15 @@
               <w:t>Pkt</w:t>
             </w:r>
             <w:r>
+              <w:rPr>
+                <w:rFonts w:ascii="Aptos" w:eastAsia="Aptos" w:hAnsi="Aptos" w:cs="Aptos"/>
+                <w:b/>
+                <w:bCs/>
+                <w:lang w:val="pl"/>
+              </w:rPr>
+              <w:t>.</w:t>
+            </w:r>
+            <w:r>
               <w:br/>
             </w:r>
             <w:r>
@@ -329,16 +338,16 @@
               <w:t>Pkt</w:t>
             </w:r>
             <w:r>
-              <w:br/>
-            </w:r>
-            <w:r>
               <w:rPr>
                 <w:rFonts w:ascii="Aptos" w:eastAsia="Aptos" w:hAnsi="Aptos" w:cs="Aptos"/>
                 <w:b/>
                 <w:bCs/>
                 <w:lang w:val="pl"/>
               </w:rPr>
-              <w:t>SE</w:t>
+              <w:t>.</w:t>
+            </w:r>
+            <w:r>
+              <w:br/>
             </w:r>
             <w:r>
               <w:rPr>
@@ -347,7 +356,7 @@
                 <w:bCs/>
                 <w:lang w:val="pl"/>
               </w:rPr>
-              <w:t xml:space="preserve">T </w:t>
+              <w:t>SE</w:t>
             </w:r>
             <w:r>
               <w:rPr>
@@ -356,29 +365,8 @@
                 <w:bCs/>
                 <w:lang w:val="pl"/>
               </w:rPr>
-              <w:t>2</w:t>
-            </w:r>
-          </w:p>
-        </w:tc>
-        <w:tc>
-          <w:tcPr>
-            <w:tcW w:w="855" w:type="dxa"/>
-            <w:tcBorders>
-              <w:top w:val="single" w:sz="4" w:space="0" w:color="000000" w:themeColor="text1"/>
-              <w:left w:val="single" w:sz="4" w:space="0" w:color="000000" w:themeColor="text1"/>
-              <w:bottom w:val="single" w:sz="4" w:space="0" w:color="auto"/>
-              <w:right w:val="single" w:sz="4" w:space="0" w:color="auto"/>
-            </w:tcBorders>
-            <w:tcMar>
-              <w:left w:w="108" w:type="dxa"/>
-              <w:right w:w="108" w:type="dxa"/>
-            </w:tcMar>
-            <w:vAlign w:val="center"/>
-          </w:tcPr>
-          <w:p>
-            <w:pPr>
-              <w:jc w:val="center"/>
-            </w:pPr>
+              <w:t xml:space="preserve">T </w:t>
+            </w:r>
             <w:r>
               <w:rPr>
                 <w:rFonts w:ascii="Aptos" w:eastAsia="Aptos" w:hAnsi="Aptos" w:cs="Aptos"/>
@@ -386,11 +374,29 @@
                 <w:bCs/>
                 <w:lang w:val="pl"/>
               </w:rPr>
-              <w:t>Pkt</w:t>
-            </w:r>
-            <w:r>
-              <w:br/>
-            </w:r>
+              <w:t>2</w:t>
+            </w:r>
+          </w:p>
+        </w:tc>
+        <w:tc>
+          <w:tcPr>
+            <w:tcW w:w="855" w:type="dxa"/>
+            <w:tcBorders>
+              <w:top w:val="single" w:sz="4" w:space="0" w:color="000000" w:themeColor="text1"/>
+              <w:left w:val="single" w:sz="4" w:space="0" w:color="000000" w:themeColor="text1"/>
+              <w:bottom w:val="single" w:sz="4" w:space="0" w:color="auto"/>
+              <w:right w:val="single" w:sz="4" w:space="0" w:color="auto"/>
+            </w:tcBorders>
+            <w:tcMar>
+              <w:left w:w="108" w:type="dxa"/>
+              <w:right w:w="108" w:type="dxa"/>
+            </w:tcMar>
+            <w:vAlign w:val="center"/>
+          </w:tcPr>
+          <w:p>
+            <w:pPr>
+              <w:jc w:val="center"/>
+            </w:pPr>
             <w:r>
               <w:rPr>
                 <w:rFonts w:ascii="Aptos" w:eastAsia="Aptos" w:hAnsi="Aptos" w:cs="Aptos"/>
@@ -398,7 +404,7 @@
                 <w:bCs/>
                 <w:lang w:val="pl"/>
               </w:rPr>
-              <w:t>SE</w:t>
+              <w:t>Pkt</w:t>
             </w:r>
             <w:r>
               <w:rPr>
@@ -407,7 +413,10 @@
                 <w:bCs/>
                 <w:lang w:val="pl"/>
               </w:rPr>
-              <w:t xml:space="preserve">T </w:t>
+              <w:t>.</w:t>
+            </w:r>
+            <w:r>
+              <w:br/>
             </w:r>
             <w:r>
               <w:rPr>
@@ -416,29 +425,8 @@
                 <w:bCs/>
                 <w:lang w:val="pl"/>
               </w:rPr>
-              <w:t>3</w:t>
-            </w:r>
-          </w:p>
-        </w:tc>
-        <w:tc>
-          <w:tcPr>
-            <w:tcW w:w="855" w:type="dxa"/>
-            <w:tcBorders>
-              <w:top w:val="single" w:sz="4" w:space="0" w:color="000000" w:themeColor="text1"/>
-              <w:left w:val="single" w:sz="4" w:space="0" w:color="auto"/>
-              <w:bottom w:val="single" w:sz="4" w:space="0" w:color="auto"/>
-              <w:right w:val="single" w:sz="4" w:space="0" w:color="auto"/>
-            </w:tcBorders>
-            <w:tcMar>
-              <w:left w:w="108" w:type="dxa"/>
-              <w:right w:w="108" w:type="dxa"/>
-            </w:tcMar>
-            <w:vAlign w:val="center"/>
-          </w:tcPr>
-          <w:p>
-            <w:pPr>
-              <w:jc w:val="center"/>
-            </w:pPr>
+              <w:t>SE</w:t>
+            </w:r>
             <w:r>
               <w:rPr>
                 <w:rFonts w:ascii="Aptos" w:eastAsia="Aptos" w:hAnsi="Aptos" w:cs="Aptos"/>
@@ -446,10 +434,7 @@
                 <w:bCs/>
                 <w:lang w:val="pl"/>
               </w:rPr>
-              <w:t>Pkt</w:t>
-            </w:r>
-            <w:r>
-              <w:br/>
+              <w:t xml:space="preserve">T </w:t>
             </w:r>
             <w:r>
               <w:rPr>
@@ -458,8 +443,29 @@
                 <w:bCs/>
                 <w:lang w:val="pl"/>
               </w:rPr>
-              <w:t>SE</w:t>
-            </w:r>
+              <w:t>3</w:t>
+            </w:r>
+          </w:p>
+        </w:tc>
+        <w:tc>
+          <w:tcPr>
+            <w:tcW w:w="855" w:type="dxa"/>
+            <w:tcBorders>
+              <w:top w:val="single" w:sz="4" w:space="0" w:color="000000" w:themeColor="text1"/>
+              <w:left w:val="single" w:sz="4" w:space="0" w:color="auto"/>
+              <w:bottom w:val="single" w:sz="4" w:space="0" w:color="auto"/>
+              <w:right w:val="single" w:sz="4" w:space="0" w:color="auto"/>
+            </w:tcBorders>
+            <w:tcMar>
+              <w:left w:w="108" w:type="dxa"/>
+              <w:right w:w="108" w:type="dxa"/>
+            </w:tcMar>
+            <w:vAlign w:val="center"/>
+          </w:tcPr>
+          <w:p>
+            <w:pPr>
+              <w:jc w:val="center"/>
+            </w:pPr>
             <w:r>
               <w:rPr>
                 <w:rFonts w:ascii="Aptos" w:eastAsia="Aptos" w:hAnsi="Aptos" w:cs="Aptos"/>
@@ -467,7 +473,7 @@
                 <w:bCs/>
                 <w:lang w:val="pl"/>
               </w:rPr>
-              <w:t xml:space="preserve">T </w:t>
+              <w:t>Pkt</w:t>
             </w:r>
             <w:r>
               <w:rPr>
@@ -476,29 +482,11 @@
                 <w:bCs/>
                 <w:lang w:val="pl"/>
               </w:rPr>
-              <w:t>4</w:t>
-            </w:r>
-          </w:p>
-        </w:tc>
-        <w:tc>
-          <w:tcPr>
-            <w:tcW w:w="855" w:type="dxa"/>
-            <w:tcBorders>
-              <w:top w:val="single" w:sz="4" w:space="0" w:color="auto"/>
-              <w:left w:val="single" w:sz="4" w:space="0" w:color="auto"/>
-              <w:bottom w:val="single" w:sz="4" w:space="0" w:color="auto"/>
-              <w:right w:val="single" w:sz="4" w:space="0" w:color="auto"/>
-            </w:tcBorders>
-            <w:tcMar>
-              <w:left w:w="108" w:type="dxa"/>
-              <w:right w:w="108" w:type="dxa"/>
-            </w:tcMar>
-            <w:vAlign w:val="center"/>
-          </w:tcPr>
-          <w:p>
-            <w:pPr>
-              <w:jc w:val="center"/>
-            </w:pPr>
+              <w:t>.</w:t>
+            </w:r>
+            <w:r>
+              <w:br/>
+            </w:r>
             <w:r>
               <w:rPr>
                 <w:rFonts w:ascii="Aptos" w:eastAsia="Aptos" w:hAnsi="Aptos" w:cs="Aptos"/>
@@ -506,7 +494,64 @@
                 <w:bCs/>
                 <w:lang w:val="pl"/>
               </w:rPr>
+              <w:t>SE</w:t>
+            </w:r>
+            <w:r>
+              <w:rPr>
+                <w:rFonts w:ascii="Aptos" w:eastAsia="Aptos" w:hAnsi="Aptos" w:cs="Aptos"/>
+                <w:b/>
+                <w:bCs/>
+                <w:lang w:val="pl"/>
+              </w:rPr>
+              <w:t xml:space="preserve">T </w:t>
+            </w:r>
+            <w:r>
+              <w:rPr>
+                <w:rFonts w:ascii="Aptos" w:eastAsia="Aptos" w:hAnsi="Aptos" w:cs="Aptos"/>
+                <w:b/>
+                <w:bCs/>
+                <w:lang w:val="pl"/>
+              </w:rPr>
+              <w:t>4</w:t>
+            </w:r>
+          </w:p>
+        </w:tc>
+        <w:tc>
+          <w:tcPr>
+            <w:tcW w:w="855" w:type="dxa"/>
+            <w:tcBorders>
+              <w:top w:val="single" w:sz="4" w:space="0" w:color="auto"/>
+              <w:left w:val="single" w:sz="4" w:space="0" w:color="auto"/>
+              <w:bottom w:val="single" w:sz="4" w:space="0" w:color="auto"/>
+              <w:right w:val="single" w:sz="4" w:space="0" w:color="auto"/>
+            </w:tcBorders>
+            <w:tcMar>
+              <w:left w:w="108" w:type="dxa"/>
+              <w:right w:w="108" w:type="dxa"/>
+            </w:tcMar>
+            <w:vAlign w:val="center"/>
+          </w:tcPr>
+          <w:p>
+            <w:pPr>
+              <w:jc w:val="center"/>
+            </w:pPr>
+            <w:r>
+              <w:rPr>
+                <w:rFonts w:ascii="Aptos" w:eastAsia="Aptos" w:hAnsi="Aptos" w:cs="Aptos"/>
+                <w:b/>
+                <w:bCs/>
+                <w:lang w:val="pl"/>
+              </w:rPr>
               <w:t>Pkt</w:t>
+            </w:r>
+            <w:r>
+              <w:rPr>
+                <w:rFonts w:ascii="Aptos" w:eastAsia="Aptos" w:hAnsi="Aptos" w:cs="Aptos"/>
+                <w:b/>
+                <w:bCs/>
+                <w:lang w:val="pl"/>
+              </w:rPr>
+              <w:t>.</w:t>
             </w:r>
             <w:r>
               <w:br/>
@@ -1144,13 +1189,13 @@
     <w:tbl>
       <w:tblPr>
         <w:tblStyle w:val="TableGrid"/>
-        <w:tblW w:w="8550" w:type="dxa"/>
-        <w:tblInd w:w="715" w:type="dxa"/>
+        <w:tblW w:w="8293" w:type="dxa"/>
+        <w:tblInd w:w="805" w:type="dxa"/>
         <w:tblLayout w:type="fixed"/>
         <w:tblLook w:val="04A0" w:firstRow="1" w:lastRow="0" w:firstColumn="1" w:lastColumn="0" w:noHBand="0" w:noVBand="1"/>
       </w:tblPr>
       <w:tblGrid>
-        <w:gridCol w:w="833"/>
+        <w:gridCol w:w="576"/>
         <w:gridCol w:w="574"/>
         <w:gridCol w:w="636"/>
         <w:gridCol w:w="580"/>
@@ -1170,7 +1215,7 @@
         </w:trPr>
         <w:tc>
           <w:tcPr>
-            <w:tcW w:w="833" w:type="dxa"/>
+            <w:tcW w:w="576" w:type="dxa"/>
             <w:tcBorders>
               <w:top w:val="single" w:sz="4" w:space="0" w:color="auto"/>
               <w:left w:val="single" w:sz="4" w:space="0" w:color="auto"/>
@@ -1308,7 +1353,7 @@
         </w:trPr>
         <w:tc>
           <w:tcPr>
-            <w:tcW w:w="833" w:type="dxa"/>
+            <w:tcW w:w="576" w:type="dxa"/>
             <w:tcBorders>
               <w:top w:val="single" w:sz="4" w:space="0" w:color="auto"/>
               <w:left w:val="single" w:sz="4" w:space="0" w:color="auto"/>
@@ -1736,28 +1781,31 @@
         </w:trPr>
         <w:tc>
           <w:tcPr>
-            <w:tcW w:w="833" w:type="dxa"/>
-            <w:tcBorders>
-              <w:top w:val="single" w:sz="4" w:space="0" w:color="auto"/>
-              <w:left w:val="single" w:sz="4" w:space="0" w:color="auto"/>
-              <w:bottom w:val="single" w:sz="4" w:space="0" w:color="auto"/>
-              <w:right w:val="single" w:sz="4" w:space="0" w:color="auto"/>
-            </w:tcBorders>
-            <w:tcMar>
-              <w:left w:w="108" w:type="dxa"/>
-              <w:right w:w="108" w:type="dxa"/>
-            </w:tcMar>
-          </w:tcPr>
-          <w:p>
-            <w:r>
-              <w:rPr>
-                <w:rFonts w:ascii="Aptos Narrow" w:eastAsia="Aptos Narrow" w:hAnsi="Aptos Narrow" w:cs="Aptos Narrow"/>
-                <w:color w:val="000000" w:themeColor="text1"/>
-                <w:sz w:val="20"/>
-                <w:szCs w:val="20"/>
-                <w:lang w:val="pl"/>
-              </w:rPr>
-              <w:t xml:space="preserve"> </w:t>
+            <w:tcW w:w="576" w:type="dxa"/>
+            <w:tcBorders>
+              <w:top w:val="single" w:sz="4" w:space="0" w:color="auto"/>
+              <w:left w:val="single" w:sz="4" w:space="0" w:color="auto"/>
+              <w:bottom w:val="single" w:sz="4" w:space="0" w:color="auto"/>
+              <w:right w:val="single" w:sz="4" w:space="0" w:color="auto"/>
+            </w:tcBorders>
+            <w:tcMar>
+              <w:left w:w="108" w:type="dxa"/>
+              <w:right w:w="108" w:type="dxa"/>
+            </w:tcMar>
+            <w:vAlign w:val="center"/>
+          </w:tcPr>
+          <w:p>
+            <w:pPr>
+              <w:jc w:val="center"/>
+            </w:pPr>
+            <w:r>
+              <w:rPr>
+                <w:rFonts w:ascii="Aptos Narrow" w:eastAsia="Aptos Narrow" w:hAnsi="Aptos Narrow" w:cs="Aptos Narrow"/>
+                <w:color w:val="000000" w:themeColor="text1"/>
+                <w:sz w:val="20"/>
+                <w:szCs w:val="20"/>
+              </w:rPr>
+              <w:t>1</w:t>
             </w:r>
           </w:p>
         </w:tc>
@@ -2134,31 +2182,31 @@
         </w:trPr>
         <w:tc>
           <w:tcPr>
-            <w:tcW w:w="833" w:type="dxa"/>
-            <w:tcBorders>
-              <w:top w:val="single" w:sz="4" w:space="0" w:color="auto"/>
-              <w:left w:val="single" w:sz="4" w:space="0" w:color="auto"/>
-              <w:bottom w:val="single" w:sz="4" w:space="0" w:color="auto"/>
-              <w:right w:val="single" w:sz="4" w:space="0" w:color="auto"/>
-            </w:tcBorders>
-            <w:tcMar>
-              <w:left w:w="108" w:type="dxa"/>
-              <w:right w:w="108" w:type="dxa"/>
-            </w:tcMar>
-          </w:tcPr>
-          <w:p>
-            <w:pPr>
-              <w:jc w:val="center"/>
-            </w:pPr>
-            <w:r>
-              <w:rPr>
-                <w:rFonts w:ascii="Aptos Narrow" w:eastAsia="Aptos Narrow" w:hAnsi="Aptos Narrow" w:cs="Aptos Narrow"/>
-                <w:color w:val="000000" w:themeColor="text1"/>
-                <w:sz w:val="20"/>
-                <w:szCs w:val="20"/>
-                <w:lang w:val="pl"/>
-              </w:rPr>
-              <w:t xml:space="preserve"> </w:t>
+            <w:tcW w:w="576" w:type="dxa"/>
+            <w:tcBorders>
+              <w:top w:val="single" w:sz="4" w:space="0" w:color="auto"/>
+              <w:left w:val="single" w:sz="4" w:space="0" w:color="auto"/>
+              <w:bottom w:val="single" w:sz="4" w:space="0" w:color="auto"/>
+              <w:right w:val="single" w:sz="4" w:space="0" w:color="auto"/>
+            </w:tcBorders>
+            <w:tcMar>
+              <w:left w:w="108" w:type="dxa"/>
+              <w:right w:w="108" w:type="dxa"/>
+            </w:tcMar>
+            <w:vAlign w:val="center"/>
+          </w:tcPr>
+          <w:p>
+            <w:pPr>
+              <w:jc w:val="center"/>
+            </w:pPr>
+            <w:r>
+              <w:rPr>
+                <w:rFonts w:ascii="Aptos Narrow" w:eastAsia="Aptos Narrow" w:hAnsi="Aptos Narrow" w:cs="Aptos Narrow"/>
+                <w:color w:val="000000" w:themeColor="text1"/>
+                <w:sz w:val="20"/>
+                <w:szCs w:val="20"/>
+              </w:rPr>
+              <w:t>2</w:t>
             </w:r>
           </w:p>
         </w:tc>
@@ -2535,31 +2583,31 @@
         </w:trPr>
         <w:tc>
           <w:tcPr>
-            <w:tcW w:w="833" w:type="dxa"/>
-            <w:tcBorders>
-              <w:top w:val="single" w:sz="4" w:space="0" w:color="auto"/>
-              <w:left w:val="single" w:sz="4" w:space="0" w:color="auto"/>
-              <w:bottom w:val="single" w:sz="4" w:space="0" w:color="auto"/>
-              <w:right w:val="single" w:sz="4" w:space="0" w:color="auto"/>
-            </w:tcBorders>
-            <w:tcMar>
-              <w:left w:w="108" w:type="dxa"/>
-              <w:right w:w="108" w:type="dxa"/>
-            </w:tcMar>
-          </w:tcPr>
-          <w:p>
-            <w:pPr>
-              <w:jc w:val="center"/>
-            </w:pPr>
-            <w:r>
-              <w:rPr>
-                <w:rFonts w:ascii="Aptos Narrow" w:eastAsia="Aptos Narrow" w:hAnsi="Aptos Narrow" w:cs="Aptos Narrow"/>
-                <w:color w:val="000000" w:themeColor="text1"/>
-                <w:sz w:val="20"/>
-                <w:szCs w:val="20"/>
-                <w:lang w:val="pl"/>
-              </w:rPr>
-              <w:t xml:space="preserve"> </w:t>
+            <w:tcW w:w="576" w:type="dxa"/>
+            <w:tcBorders>
+              <w:top w:val="single" w:sz="4" w:space="0" w:color="auto"/>
+              <w:left w:val="single" w:sz="4" w:space="0" w:color="auto"/>
+              <w:bottom w:val="single" w:sz="4" w:space="0" w:color="auto"/>
+              <w:right w:val="single" w:sz="4" w:space="0" w:color="auto"/>
+            </w:tcBorders>
+            <w:tcMar>
+              <w:left w:w="108" w:type="dxa"/>
+              <w:right w:w="108" w:type="dxa"/>
+            </w:tcMar>
+            <w:vAlign w:val="center"/>
+          </w:tcPr>
+          <w:p>
+            <w:pPr>
+              <w:jc w:val="center"/>
+            </w:pPr>
+            <w:r>
+              <w:rPr>
+                <w:rFonts w:ascii="Aptos Narrow" w:eastAsia="Aptos Narrow" w:hAnsi="Aptos Narrow" w:cs="Aptos Narrow"/>
+                <w:color w:val="000000" w:themeColor="text1"/>
+                <w:sz w:val="20"/>
+                <w:szCs w:val="20"/>
+              </w:rPr>
+              <w:t>3</w:t>
             </w:r>
           </w:p>
         </w:tc>
@@ -2936,31 +2984,31 @@
         </w:trPr>
         <w:tc>
           <w:tcPr>
-            <w:tcW w:w="833" w:type="dxa"/>
-            <w:tcBorders>
-              <w:top w:val="single" w:sz="4" w:space="0" w:color="auto"/>
-              <w:left w:val="single" w:sz="4" w:space="0" w:color="auto"/>
-              <w:bottom w:val="single" w:sz="4" w:space="0" w:color="auto"/>
-              <w:right w:val="single" w:sz="4" w:space="0" w:color="auto"/>
-            </w:tcBorders>
-            <w:tcMar>
-              <w:left w:w="108" w:type="dxa"/>
-              <w:right w:w="108" w:type="dxa"/>
-            </w:tcMar>
-          </w:tcPr>
-          <w:p>
-            <w:pPr>
-              <w:jc w:val="center"/>
-            </w:pPr>
-            <w:r>
-              <w:rPr>
-                <w:rFonts w:ascii="Aptos Narrow" w:eastAsia="Aptos Narrow" w:hAnsi="Aptos Narrow" w:cs="Aptos Narrow"/>
-                <w:color w:val="000000" w:themeColor="text1"/>
-                <w:sz w:val="20"/>
-                <w:szCs w:val="20"/>
-                <w:lang w:val="pl"/>
-              </w:rPr>
-              <w:t xml:space="preserve"> </w:t>
+            <w:tcW w:w="576" w:type="dxa"/>
+            <w:tcBorders>
+              <w:top w:val="single" w:sz="4" w:space="0" w:color="auto"/>
+              <w:left w:val="single" w:sz="4" w:space="0" w:color="auto"/>
+              <w:bottom w:val="single" w:sz="4" w:space="0" w:color="auto"/>
+              <w:right w:val="single" w:sz="4" w:space="0" w:color="auto"/>
+            </w:tcBorders>
+            <w:tcMar>
+              <w:left w:w="108" w:type="dxa"/>
+              <w:right w:w="108" w:type="dxa"/>
+            </w:tcMar>
+            <w:vAlign w:val="center"/>
+          </w:tcPr>
+          <w:p>
+            <w:pPr>
+              <w:jc w:val="center"/>
+            </w:pPr>
+            <w:r>
+              <w:rPr>
+                <w:rFonts w:ascii="Aptos Narrow" w:eastAsia="Aptos Narrow" w:hAnsi="Aptos Narrow" w:cs="Aptos Narrow"/>
+                <w:color w:val="000000" w:themeColor="text1"/>
+                <w:sz w:val="20"/>
+                <w:szCs w:val="20"/>
+              </w:rPr>
+              <w:t>4</w:t>
             </w:r>
           </w:p>
         </w:tc>
@@ -3337,31 +3385,31 @@
         </w:trPr>
         <w:tc>
           <w:tcPr>
-            <w:tcW w:w="833" w:type="dxa"/>
-            <w:tcBorders>
-              <w:top w:val="single" w:sz="4" w:space="0" w:color="auto"/>
-              <w:left w:val="single" w:sz="4" w:space="0" w:color="auto"/>
-              <w:bottom w:val="single" w:sz="4" w:space="0" w:color="auto"/>
-              <w:right w:val="single" w:sz="4" w:space="0" w:color="auto"/>
-            </w:tcBorders>
-            <w:tcMar>
-              <w:left w:w="108" w:type="dxa"/>
-              <w:right w:w="108" w:type="dxa"/>
-            </w:tcMar>
-          </w:tcPr>
-          <w:p>
-            <w:pPr>
-              <w:jc w:val="center"/>
-            </w:pPr>
-            <w:r>
-              <w:rPr>
-                <w:rFonts w:ascii="Aptos Narrow" w:eastAsia="Aptos Narrow" w:hAnsi="Aptos Narrow" w:cs="Aptos Narrow"/>
-                <w:color w:val="000000" w:themeColor="text1"/>
-                <w:sz w:val="20"/>
-                <w:szCs w:val="20"/>
-                <w:lang w:val="pl"/>
-              </w:rPr>
-              <w:t xml:space="preserve"> </w:t>
+            <w:tcW w:w="576" w:type="dxa"/>
+            <w:tcBorders>
+              <w:top w:val="single" w:sz="4" w:space="0" w:color="auto"/>
+              <w:left w:val="single" w:sz="4" w:space="0" w:color="auto"/>
+              <w:bottom w:val="single" w:sz="4" w:space="0" w:color="auto"/>
+              <w:right w:val="single" w:sz="4" w:space="0" w:color="auto"/>
+            </w:tcBorders>
+            <w:tcMar>
+              <w:left w:w="108" w:type="dxa"/>
+              <w:right w:w="108" w:type="dxa"/>
+            </w:tcMar>
+            <w:vAlign w:val="center"/>
+          </w:tcPr>
+          <w:p>
+            <w:pPr>
+              <w:jc w:val="center"/>
+            </w:pPr>
+            <w:r>
+              <w:rPr>
+                <w:rFonts w:ascii="Aptos Narrow" w:eastAsia="Aptos Narrow" w:hAnsi="Aptos Narrow" w:cs="Aptos Narrow"/>
+                <w:color w:val="000000" w:themeColor="text1"/>
+                <w:sz w:val="20"/>
+                <w:szCs w:val="20"/>
+              </w:rPr>
+              <w:t>5</w:t>
             </w:r>
           </w:p>
         </w:tc>
@@ -3738,31 +3786,31 @@
         </w:trPr>
         <w:tc>
           <w:tcPr>
-            <w:tcW w:w="833" w:type="dxa"/>
-            <w:tcBorders>
-              <w:top w:val="single" w:sz="4" w:space="0" w:color="auto"/>
-              <w:left w:val="single" w:sz="4" w:space="0" w:color="auto"/>
-              <w:bottom w:val="single" w:sz="4" w:space="0" w:color="auto"/>
-              <w:right w:val="single" w:sz="4" w:space="0" w:color="auto"/>
-            </w:tcBorders>
-            <w:tcMar>
-              <w:left w:w="108" w:type="dxa"/>
-              <w:right w:w="108" w:type="dxa"/>
-            </w:tcMar>
-          </w:tcPr>
-          <w:p>
-            <w:pPr>
-              <w:jc w:val="center"/>
-            </w:pPr>
-            <w:r>
-              <w:rPr>
-                <w:rFonts w:ascii="Aptos Narrow" w:eastAsia="Aptos Narrow" w:hAnsi="Aptos Narrow" w:cs="Aptos Narrow"/>
-                <w:color w:val="000000" w:themeColor="text1"/>
-                <w:sz w:val="20"/>
-                <w:szCs w:val="20"/>
-                <w:lang w:val="pl"/>
-              </w:rPr>
-              <w:t xml:space="preserve"> </w:t>
+            <w:tcW w:w="576" w:type="dxa"/>
+            <w:tcBorders>
+              <w:top w:val="single" w:sz="4" w:space="0" w:color="auto"/>
+              <w:left w:val="single" w:sz="4" w:space="0" w:color="auto"/>
+              <w:bottom w:val="single" w:sz="4" w:space="0" w:color="auto"/>
+              <w:right w:val="single" w:sz="4" w:space="0" w:color="auto"/>
+            </w:tcBorders>
+            <w:tcMar>
+              <w:left w:w="108" w:type="dxa"/>
+              <w:right w:w="108" w:type="dxa"/>
+            </w:tcMar>
+            <w:vAlign w:val="center"/>
+          </w:tcPr>
+          <w:p>
+            <w:pPr>
+              <w:jc w:val="center"/>
+            </w:pPr>
+            <w:r>
+              <w:rPr>
+                <w:rFonts w:ascii="Aptos Narrow" w:eastAsia="Aptos Narrow" w:hAnsi="Aptos Narrow" w:cs="Aptos Narrow"/>
+                <w:color w:val="000000" w:themeColor="text1"/>
+                <w:sz w:val="20"/>
+                <w:szCs w:val="20"/>
+              </w:rPr>
+              <w:t>6</w:t>
             </w:r>
           </w:p>
         </w:tc>
@@ -4139,31 +4187,31 @@
         </w:trPr>
         <w:tc>
           <w:tcPr>
-            <w:tcW w:w="833" w:type="dxa"/>
-            <w:tcBorders>
-              <w:top w:val="single" w:sz="4" w:space="0" w:color="auto"/>
-              <w:left w:val="single" w:sz="4" w:space="0" w:color="auto"/>
-              <w:bottom w:val="single" w:sz="4" w:space="0" w:color="auto"/>
-              <w:right w:val="single" w:sz="4" w:space="0" w:color="auto"/>
-            </w:tcBorders>
-            <w:tcMar>
-              <w:left w:w="108" w:type="dxa"/>
-              <w:right w:w="108" w:type="dxa"/>
-            </w:tcMar>
-          </w:tcPr>
-          <w:p>
-            <w:pPr>
-              <w:jc w:val="center"/>
-            </w:pPr>
-            <w:r>
-              <w:rPr>
-                <w:rFonts w:ascii="Aptos Narrow" w:eastAsia="Aptos Narrow" w:hAnsi="Aptos Narrow" w:cs="Aptos Narrow"/>
-                <w:color w:val="000000" w:themeColor="text1"/>
-                <w:sz w:val="20"/>
-                <w:szCs w:val="20"/>
-                <w:lang w:val="pl"/>
-              </w:rPr>
-              <w:t xml:space="preserve"> </w:t>
+            <w:tcW w:w="576" w:type="dxa"/>
+            <w:tcBorders>
+              <w:top w:val="single" w:sz="4" w:space="0" w:color="auto"/>
+              <w:left w:val="single" w:sz="4" w:space="0" w:color="auto"/>
+              <w:bottom w:val="single" w:sz="4" w:space="0" w:color="auto"/>
+              <w:right w:val="single" w:sz="4" w:space="0" w:color="auto"/>
+            </w:tcBorders>
+            <w:tcMar>
+              <w:left w:w="108" w:type="dxa"/>
+              <w:right w:w="108" w:type="dxa"/>
+            </w:tcMar>
+            <w:vAlign w:val="center"/>
+          </w:tcPr>
+          <w:p>
+            <w:pPr>
+              <w:jc w:val="center"/>
+            </w:pPr>
+            <w:r>
+              <w:rPr>
+                <w:rFonts w:ascii="Aptos Narrow" w:eastAsia="Aptos Narrow" w:hAnsi="Aptos Narrow" w:cs="Aptos Narrow"/>
+                <w:color w:val="000000" w:themeColor="text1"/>
+                <w:sz w:val="20"/>
+                <w:szCs w:val="20"/>
+              </w:rPr>
+              <w:t>7</w:t>
             </w:r>
           </w:p>
         </w:tc>
@@ -4540,31 +4588,31 @@
         </w:trPr>
         <w:tc>
           <w:tcPr>
-            <w:tcW w:w="833" w:type="dxa"/>
-            <w:tcBorders>
-              <w:top w:val="single" w:sz="4" w:space="0" w:color="auto"/>
-              <w:left w:val="single" w:sz="4" w:space="0" w:color="auto"/>
-              <w:bottom w:val="single" w:sz="4" w:space="0" w:color="auto"/>
-              <w:right w:val="single" w:sz="4" w:space="0" w:color="auto"/>
-            </w:tcBorders>
-            <w:tcMar>
-              <w:left w:w="108" w:type="dxa"/>
-              <w:right w:w="108" w:type="dxa"/>
-            </w:tcMar>
-          </w:tcPr>
-          <w:p>
-            <w:pPr>
-              <w:jc w:val="center"/>
-            </w:pPr>
-            <w:r>
-              <w:rPr>
-                <w:rFonts w:ascii="Aptos Narrow" w:eastAsia="Aptos Narrow" w:hAnsi="Aptos Narrow" w:cs="Aptos Narrow"/>
-                <w:color w:val="000000" w:themeColor="text1"/>
-                <w:sz w:val="20"/>
-                <w:szCs w:val="20"/>
-                <w:lang w:val="pl"/>
-              </w:rPr>
-              <w:t xml:space="preserve"> </w:t>
+            <w:tcW w:w="576" w:type="dxa"/>
+            <w:tcBorders>
+              <w:top w:val="single" w:sz="4" w:space="0" w:color="auto"/>
+              <w:left w:val="single" w:sz="4" w:space="0" w:color="auto"/>
+              <w:bottom w:val="single" w:sz="4" w:space="0" w:color="auto"/>
+              <w:right w:val="single" w:sz="4" w:space="0" w:color="auto"/>
+            </w:tcBorders>
+            <w:tcMar>
+              <w:left w:w="108" w:type="dxa"/>
+              <w:right w:w="108" w:type="dxa"/>
+            </w:tcMar>
+            <w:vAlign w:val="center"/>
+          </w:tcPr>
+          <w:p>
+            <w:pPr>
+              <w:jc w:val="center"/>
+            </w:pPr>
+            <w:r>
+              <w:rPr>
+                <w:rFonts w:ascii="Aptos Narrow" w:eastAsia="Aptos Narrow" w:hAnsi="Aptos Narrow" w:cs="Aptos Narrow"/>
+                <w:color w:val="000000" w:themeColor="text1"/>
+                <w:sz w:val="20"/>
+                <w:szCs w:val="20"/>
+              </w:rPr>
+              <w:t>8</w:t>
             </w:r>
           </w:p>
         </w:tc>
@@ -4941,31 +4989,31 @@
         </w:trPr>
         <w:tc>
           <w:tcPr>
-            <w:tcW w:w="833" w:type="dxa"/>
-            <w:tcBorders>
-              <w:top w:val="single" w:sz="4" w:space="0" w:color="auto"/>
-              <w:left w:val="single" w:sz="4" w:space="0" w:color="auto"/>
-              <w:bottom w:val="single" w:sz="4" w:space="0" w:color="auto"/>
-              <w:right w:val="single" w:sz="4" w:space="0" w:color="auto"/>
-            </w:tcBorders>
-            <w:tcMar>
-              <w:left w:w="108" w:type="dxa"/>
-              <w:right w:w="108" w:type="dxa"/>
-            </w:tcMar>
-          </w:tcPr>
-          <w:p>
-            <w:pPr>
-              <w:jc w:val="center"/>
-            </w:pPr>
-            <w:r>
-              <w:rPr>
-                <w:rFonts w:ascii="Aptos Narrow" w:eastAsia="Aptos Narrow" w:hAnsi="Aptos Narrow" w:cs="Aptos Narrow"/>
-                <w:color w:val="000000" w:themeColor="text1"/>
-                <w:sz w:val="20"/>
-                <w:szCs w:val="20"/>
-                <w:lang w:val="pl"/>
-              </w:rPr>
-              <w:t xml:space="preserve"> </w:t>
+            <w:tcW w:w="576" w:type="dxa"/>
+            <w:tcBorders>
+              <w:top w:val="single" w:sz="4" w:space="0" w:color="auto"/>
+              <w:left w:val="single" w:sz="4" w:space="0" w:color="auto"/>
+              <w:bottom w:val="single" w:sz="4" w:space="0" w:color="auto"/>
+              <w:right w:val="single" w:sz="4" w:space="0" w:color="auto"/>
+            </w:tcBorders>
+            <w:tcMar>
+              <w:left w:w="108" w:type="dxa"/>
+              <w:right w:w="108" w:type="dxa"/>
+            </w:tcMar>
+            <w:vAlign w:val="center"/>
+          </w:tcPr>
+          <w:p>
+            <w:pPr>
+              <w:jc w:val="center"/>
+            </w:pPr>
+            <w:r>
+              <w:rPr>
+                <w:rFonts w:ascii="Aptos Narrow" w:eastAsia="Aptos Narrow" w:hAnsi="Aptos Narrow" w:cs="Aptos Narrow"/>
+                <w:color w:val="000000" w:themeColor="text1"/>
+                <w:sz w:val="20"/>
+                <w:szCs w:val="20"/>
+              </w:rPr>
+              <w:t>9</w:t>
             </w:r>
           </w:p>
         </w:tc>
@@ -5342,31 +5390,31 @@
         </w:trPr>
         <w:tc>
           <w:tcPr>
-            <w:tcW w:w="833" w:type="dxa"/>
-            <w:tcBorders>
-              <w:top w:val="single" w:sz="4" w:space="0" w:color="auto"/>
-              <w:left w:val="single" w:sz="4" w:space="0" w:color="auto"/>
-              <w:bottom w:val="single" w:sz="4" w:space="0" w:color="auto"/>
-              <w:right w:val="single" w:sz="4" w:space="0" w:color="auto"/>
-            </w:tcBorders>
-            <w:tcMar>
-              <w:left w:w="108" w:type="dxa"/>
-              <w:right w:w="108" w:type="dxa"/>
-            </w:tcMar>
-          </w:tcPr>
-          <w:p>
-            <w:pPr>
-              <w:jc w:val="center"/>
-            </w:pPr>
-            <w:r>
-              <w:rPr>
-                <w:rFonts w:ascii="Aptos Narrow" w:eastAsia="Aptos Narrow" w:hAnsi="Aptos Narrow" w:cs="Aptos Narrow"/>
-                <w:color w:val="000000" w:themeColor="text1"/>
-                <w:sz w:val="20"/>
-                <w:szCs w:val="20"/>
-                <w:lang w:val="pl"/>
-              </w:rPr>
-              <w:t xml:space="preserve"> </w:t>
+            <w:tcW w:w="576" w:type="dxa"/>
+            <w:tcBorders>
+              <w:top w:val="single" w:sz="4" w:space="0" w:color="auto"/>
+              <w:left w:val="single" w:sz="4" w:space="0" w:color="auto"/>
+              <w:bottom w:val="single" w:sz="4" w:space="0" w:color="auto"/>
+              <w:right w:val="single" w:sz="4" w:space="0" w:color="auto"/>
+            </w:tcBorders>
+            <w:tcMar>
+              <w:left w:w="108" w:type="dxa"/>
+              <w:right w:w="108" w:type="dxa"/>
+            </w:tcMar>
+            <w:vAlign w:val="center"/>
+          </w:tcPr>
+          <w:p>
+            <w:pPr>
+              <w:jc w:val="center"/>
+            </w:pPr>
+            <w:r>
+              <w:rPr>
+                <w:rFonts w:ascii="Aptos Narrow" w:eastAsia="Aptos Narrow" w:hAnsi="Aptos Narrow" w:cs="Aptos Narrow"/>
+                <w:color w:val="000000" w:themeColor="text1"/>
+                <w:sz w:val="20"/>
+                <w:szCs w:val="20"/>
+              </w:rPr>
+              <w:t>10</w:t>
             </w:r>
           </w:p>
         </w:tc>
@@ -5743,31 +5791,31 @@
         </w:trPr>
         <w:tc>
           <w:tcPr>
-            <w:tcW w:w="833" w:type="dxa"/>
-            <w:tcBorders>
-              <w:top w:val="single" w:sz="4" w:space="0" w:color="auto"/>
-              <w:left w:val="single" w:sz="4" w:space="0" w:color="auto"/>
-              <w:bottom w:val="single" w:sz="4" w:space="0" w:color="auto"/>
-              <w:right w:val="single" w:sz="4" w:space="0" w:color="auto"/>
-            </w:tcBorders>
-            <w:tcMar>
-              <w:left w:w="108" w:type="dxa"/>
-              <w:right w:w="108" w:type="dxa"/>
-            </w:tcMar>
-          </w:tcPr>
-          <w:p>
-            <w:pPr>
-              <w:jc w:val="center"/>
-            </w:pPr>
-            <w:r>
-              <w:rPr>
-                <w:rFonts w:ascii="Aptos Narrow" w:eastAsia="Aptos Narrow" w:hAnsi="Aptos Narrow" w:cs="Aptos Narrow"/>
-                <w:color w:val="000000" w:themeColor="text1"/>
-                <w:sz w:val="20"/>
-                <w:szCs w:val="20"/>
-                <w:lang w:val="pl"/>
-              </w:rPr>
-              <w:t xml:space="preserve"> </w:t>
+            <w:tcW w:w="576" w:type="dxa"/>
+            <w:tcBorders>
+              <w:top w:val="single" w:sz="4" w:space="0" w:color="auto"/>
+              <w:left w:val="single" w:sz="4" w:space="0" w:color="auto"/>
+              <w:bottom w:val="single" w:sz="4" w:space="0" w:color="auto"/>
+              <w:right w:val="single" w:sz="4" w:space="0" w:color="auto"/>
+            </w:tcBorders>
+            <w:tcMar>
+              <w:left w:w="108" w:type="dxa"/>
+              <w:right w:w="108" w:type="dxa"/>
+            </w:tcMar>
+            <w:vAlign w:val="center"/>
+          </w:tcPr>
+          <w:p>
+            <w:pPr>
+              <w:jc w:val="center"/>
+            </w:pPr>
+            <w:r>
+              <w:rPr>
+                <w:rFonts w:ascii="Aptos Narrow" w:eastAsia="Aptos Narrow" w:hAnsi="Aptos Narrow" w:cs="Aptos Narrow"/>
+                <w:color w:val="000000" w:themeColor="text1"/>
+                <w:sz w:val="20"/>
+                <w:szCs w:val="20"/>
+              </w:rPr>
+              <w:t>11</w:t>
             </w:r>
           </w:p>
         </w:tc>
@@ -6144,31 +6192,31 @@
         </w:trPr>
         <w:tc>
           <w:tcPr>
-            <w:tcW w:w="833" w:type="dxa"/>
-            <w:tcBorders>
-              <w:top w:val="single" w:sz="4" w:space="0" w:color="auto"/>
-              <w:left w:val="single" w:sz="4" w:space="0" w:color="auto"/>
-              <w:bottom w:val="single" w:sz="4" w:space="0" w:color="auto"/>
-              <w:right w:val="single" w:sz="4" w:space="0" w:color="auto"/>
-            </w:tcBorders>
-            <w:tcMar>
-              <w:left w:w="108" w:type="dxa"/>
-              <w:right w:w="108" w:type="dxa"/>
-            </w:tcMar>
-          </w:tcPr>
-          <w:p>
-            <w:pPr>
-              <w:jc w:val="center"/>
-            </w:pPr>
-            <w:r>
-              <w:rPr>
-                <w:rFonts w:ascii="Aptos Narrow" w:eastAsia="Aptos Narrow" w:hAnsi="Aptos Narrow" w:cs="Aptos Narrow"/>
-                <w:color w:val="000000" w:themeColor="text1"/>
-                <w:sz w:val="20"/>
-                <w:szCs w:val="20"/>
-                <w:lang w:val="pl"/>
-              </w:rPr>
-              <w:t xml:space="preserve"> </w:t>
+            <w:tcW w:w="576" w:type="dxa"/>
+            <w:tcBorders>
+              <w:top w:val="single" w:sz="4" w:space="0" w:color="auto"/>
+              <w:left w:val="single" w:sz="4" w:space="0" w:color="auto"/>
+              <w:bottom w:val="single" w:sz="4" w:space="0" w:color="auto"/>
+              <w:right w:val="single" w:sz="4" w:space="0" w:color="auto"/>
+            </w:tcBorders>
+            <w:tcMar>
+              <w:left w:w="108" w:type="dxa"/>
+              <w:right w:w="108" w:type="dxa"/>
+            </w:tcMar>
+            <w:vAlign w:val="center"/>
+          </w:tcPr>
+          <w:p>
+            <w:pPr>
+              <w:jc w:val="center"/>
+            </w:pPr>
+            <w:r>
+              <w:rPr>
+                <w:rFonts w:ascii="Aptos Narrow" w:eastAsia="Aptos Narrow" w:hAnsi="Aptos Narrow" w:cs="Aptos Narrow"/>
+                <w:color w:val="000000" w:themeColor="text1"/>
+                <w:sz w:val="20"/>
+                <w:szCs w:val="20"/>
+              </w:rPr>
+              <w:t>12</w:t>
             </w:r>
           </w:p>
         </w:tc>
@@ -6545,31 +6593,31 @@
         </w:trPr>
         <w:tc>
           <w:tcPr>
-            <w:tcW w:w="833" w:type="dxa"/>
-            <w:tcBorders>
-              <w:top w:val="single" w:sz="4" w:space="0" w:color="auto"/>
-              <w:left w:val="single" w:sz="4" w:space="0" w:color="auto"/>
-              <w:bottom w:val="single" w:sz="4" w:space="0" w:color="auto"/>
-              <w:right w:val="single" w:sz="4" w:space="0" w:color="auto"/>
-            </w:tcBorders>
-            <w:tcMar>
-              <w:left w:w="108" w:type="dxa"/>
-              <w:right w:w="108" w:type="dxa"/>
-            </w:tcMar>
-          </w:tcPr>
-          <w:p>
-            <w:pPr>
-              <w:jc w:val="center"/>
-            </w:pPr>
-            <w:r>
-              <w:rPr>
-                <w:rFonts w:ascii="Aptos Narrow" w:eastAsia="Aptos Narrow" w:hAnsi="Aptos Narrow" w:cs="Aptos Narrow"/>
-                <w:color w:val="000000" w:themeColor="text1"/>
-                <w:sz w:val="20"/>
-                <w:szCs w:val="20"/>
-                <w:lang w:val="pl"/>
-              </w:rPr>
-              <w:t xml:space="preserve"> </w:t>
+            <w:tcW w:w="576" w:type="dxa"/>
+            <w:tcBorders>
+              <w:top w:val="single" w:sz="4" w:space="0" w:color="auto"/>
+              <w:left w:val="single" w:sz="4" w:space="0" w:color="auto"/>
+              <w:bottom w:val="single" w:sz="4" w:space="0" w:color="auto"/>
+              <w:right w:val="single" w:sz="4" w:space="0" w:color="auto"/>
+            </w:tcBorders>
+            <w:tcMar>
+              <w:left w:w="108" w:type="dxa"/>
+              <w:right w:w="108" w:type="dxa"/>
+            </w:tcMar>
+            <w:vAlign w:val="center"/>
+          </w:tcPr>
+          <w:p>
+            <w:pPr>
+              <w:jc w:val="center"/>
+            </w:pPr>
+            <w:r>
+              <w:rPr>
+                <w:rFonts w:ascii="Aptos Narrow" w:eastAsia="Aptos Narrow" w:hAnsi="Aptos Narrow" w:cs="Aptos Narrow"/>
+                <w:color w:val="000000" w:themeColor="text1"/>
+                <w:sz w:val="20"/>
+                <w:szCs w:val="20"/>
+              </w:rPr>
+              <w:t>13</w:t>
             </w:r>
           </w:p>
         </w:tc>
@@ -6946,31 +6994,31 @@
         </w:trPr>
         <w:tc>
           <w:tcPr>
-            <w:tcW w:w="833" w:type="dxa"/>
-            <w:tcBorders>
-              <w:top w:val="single" w:sz="4" w:space="0" w:color="auto"/>
-              <w:left w:val="single" w:sz="4" w:space="0" w:color="auto"/>
-              <w:bottom w:val="single" w:sz="4" w:space="0" w:color="auto"/>
-              <w:right w:val="single" w:sz="4" w:space="0" w:color="auto"/>
-            </w:tcBorders>
-            <w:tcMar>
-              <w:left w:w="108" w:type="dxa"/>
-              <w:right w:w="108" w:type="dxa"/>
-            </w:tcMar>
-          </w:tcPr>
-          <w:p>
-            <w:pPr>
-              <w:jc w:val="center"/>
-            </w:pPr>
-            <w:r>
-              <w:rPr>
-                <w:rFonts w:ascii="Aptos Narrow" w:eastAsia="Aptos Narrow" w:hAnsi="Aptos Narrow" w:cs="Aptos Narrow"/>
-                <w:color w:val="000000" w:themeColor="text1"/>
-                <w:sz w:val="20"/>
-                <w:szCs w:val="20"/>
-                <w:lang w:val="pl"/>
-              </w:rPr>
-              <w:t xml:space="preserve"> </w:t>
+            <w:tcW w:w="576" w:type="dxa"/>
+            <w:tcBorders>
+              <w:top w:val="single" w:sz="4" w:space="0" w:color="auto"/>
+              <w:left w:val="single" w:sz="4" w:space="0" w:color="auto"/>
+              <w:bottom w:val="single" w:sz="4" w:space="0" w:color="auto"/>
+              <w:right w:val="single" w:sz="4" w:space="0" w:color="auto"/>
+            </w:tcBorders>
+            <w:tcMar>
+              <w:left w:w="108" w:type="dxa"/>
+              <w:right w:w="108" w:type="dxa"/>
+            </w:tcMar>
+            <w:vAlign w:val="center"/>
+          </w:tcPr>
+          <w:p>
+            <w:pPr>
+              <w:jc w:val="center"/>
+            </w:pPr>
+            <w:r>
+              <w:rPr>
+                <w:rFonts w:ascii="Aptos Narrow" w:eastAsia="Aptos Narrow" w:hAnsi="Aptos Narrow" w:cs="Aptos Narrow"/>
+                <w:color w:val="000000" w:themeColor="text1"/>
+                <w:sz w:val="20"/>
+                <w:szCs w:val="20"/>
+              </w:rPr>
+              <w:t>14</w:t>
             </w:r>
           </w:p>
         </w:tc>
@@ -7347,31 +7395,31 @@
         </w:trPr>
         <w:tc>
           <w:tcPr>
-            <w:tcW w:w="833" w:type="dxa"/>
-            <w:tcBorders>
-              <w:top w:val="single" w:sz="4" w:space="0" w:color="auto"/>
-              <w:left w:val="single" w:sz="4" w:space="0" w:color="auto"/>
-              <w:bottom w:val="single" w:sz="4" w:space="0" w:color="auto"/>
-              <w:right w:val="single" w:sz="4" w:space="0" w:color="auto"/>
-            </w:tcBorders>
-            <w:tcMar>
-              <w:left w:w="108" w:type="dxa"/>
-              <w:right w:w="108" w:type="dxa"/>
-            </w:tcMar>
-          </w:tcPr>
-          <w:p>
-            <w:pPr>
-              <w:jc w:val="center"/>
-            </w:pPr>
-            <w:r>
-              <w:rPr>
-                <w:rFonts w:ascii="Aptos Narrow" w:eastAsia="Aptos Narrow" w:hAnsi="Aptos Narrow" w:cs="Aptos Narrow"/>
-                <w:color w:val="000000" w:themeColor="text1"/>
-                <w:sz w:val="20"/>
-                <w:szCs w:val="20"/>
-                <w:lang w:val="pl"/>
-              </w:rPr>
-              <w:t xml:space="preserve"> </w:t>
+            <w:tcW w:w="576" w:type="dxa"/>
+            <w:tcBorders>
+              <w:top w:val="single" w:sz="4" w:space="0" w:color="auto"/>
+              <w:left w:val="single" w:sz="4" w:space="0" w:color="auto"/>
+              <w:bottom w:val="single" w:sz="4" w:space="0" w:color="auto"/>
+              <w:right w:val="single" w:sz="4" w:space="0" w:color="auto"/>
+            </w:tcBorders>
+            <w:tcMar>
+              <w:left w:w="108" w:type="dxa"/>
+              <w:right w:w="108" w:type="dxa"/>
+            </w:tcMar>
+            <w:vAlign w:val="center"/>
+          </w:tcPr>
+          <w:p>
+            <w:pPr>
+              <w:jc w:val="center"/>
+            </w:pPr>
+            <w:r>
+              <w:rPr>
+                <w:rFonts w:ascii="Aptos Narrow" w:eastAsia="Aptos Narrow" w:hAnsi="Aptos Narrow" w:cs="Aptos Narrow"/>
+                <w:color w:val="000000" w:themeColor="text1"/>
+                <w:sz w:val="20"/>
+                <w:szCs w:val="20"/>
+              </w:rPr>
+              <w:t>15</w:t>
             </w:r>
           </w:p>
         </w:tc>
@@ -7748,31 +7796,31 @@
         </w:trPr>
         <w:tc>
           <w:tcPr>
-            <w:tcW w:w="833" w:type="dxa"/>
-            <w:tcBorders>
-              <w:top w:val="single" w:sz="4" w:space="0" w:color="auto"/>
-              <w:left w:val="single" w:sz="4" w:space="0" w:color="auto"/>
-              <w:bottom w:val="single" w:sz="4" w:space="0" w:color="auto"/>
-              <w:right w:val="single" w:sz="4" w:space="0" w:color="auto"/>
-            </w:tcBorders>
-            <w:tcMar>
-              <w:left w:w="108" w:type="dxa"/>
-              <w:right w:w="108" w:type="dxa"/>
-            </w:tcMar>
-          </w:tcPr>
-          <w:p>
-            <w:pPr>
-              <w:jc w:val="center"/>
-            </w:pPr>
-            <w:r>
-              <w:rPr>
-                <w:rFonts w:ascii="Aptos Narrow" w:eastAsia="Aptos Narrow" w:hAnsi="Aptos Narrow" w:cs="Aptos Narrow"/>
-                <w:color w:val="000000" w:themeColor="text1"/>
-                <w:sz w:val="20"/>
-                <w:szCs w:val="20"/>
-                <w:lang w:val="pl"/>
-              </w:rPr>
-              <w:t xml:space="preserve"> </w:t>
+            <w:tcW w:w="576" w:type="dxa"/>
+            <w:tcBorders>
+              <w:top w:val="single" w:sz="4" w:space="0" w:color="auto"/>
+              <w:left w:val="single" w:sz="4" w:space="0" w:color="auto"/>
+              <w:bottom w:val="single" w:sz="4" w:space="0" w:color="auto"/>
+              <w:right w:val="single" w:sz="4" w:space="0" w:color="auto"/>
+            </w:tcBorders>
+            <w:tcMar>
+              <w:left w:w="108" w:type="dxa"/>
+              <w:right w:w="108" w:type="dxa"/>
+            </w:tcMar>
+            <w:vAlign w:val="center"/>
+          </w:tcPr>
+          <w:p>
+            <w:pPr>
+              <w:jc w:val="center"/>
+            </w:pPr>
+            <w:r>
+              <w:rPr>
+                <w:rFonts w:ascii="Aptos Narrow" w:eastAsia="Aptos Narrow" w:hAnsi="Aptos Narrow" w:cs="Aptos Narrow"/>
+                <w:color w:val="000000" w:themeColor="text1"/>
+                <w:sz w:val="20"/>
+                <w:szCs w:val="20"/>
+              </w:rPr>
+              <w:t>16</w:t>
             </w:r>
           </w:p>
         </w:tc>
@@ -8149,31 +8197,31 @@
         </w:trPr>
         <w:tc>
           <w:tcPr>
-            <w:tcW w:w="833" w:type="dxa"/>
-            <w:tcBorders>
-              <w:top w:val="single" w:sz="4" w:space="0" w:color="auto"/>
-              <w:left w:val="single" w:sz="4" w:space="0" w:color="auto"/>
-              <w:bottom w:val="single" w:sz="4" w:space="0" w:color="auto"/>
-              <w:right w:val="single" w:sz="4" w:space="0" w:color="auto"/>
-            </w:tcBorders>
-            <w:tcMar>
-              <w:left w:w="108" w:type="dxa"/>
-              <w:right w:w="108" w:type="dxa"/>
-            </w:tcMar>
-          </w:tcPr>
-          <w:p>
-            <w:pPr>
-              <w:jc w:val="center"/>
-            </w:pPr>
-            <w:r>
-              <w:rPr>
-                <w:rFonts w:ascii="Aptos Narrow" w:eastAsia="Aptos Narrow" w:hAnsi="Aptos Narrow" w:cs="Aptos Narrow"/>
-                <w:color w:val="000000" w:themeColor="text1"/>
-                <w:sz w:val="20"/>
-                <w:szCs w:val="20"/>
-                <w:lang w:val="pl"/>
-              </w:rPr>
-              <w:t xml:space="preserve"> </w:t>
+            <w:tcW w:w="576" w:type="dxa"/>
+            <w:tcBorders>
+              <w:top w:val="single" w:sz="4" w:space="0" w:color="auto"/>
+              <w:left w:val="single" w:sz="4" w:space="0" w:color="auto"/>
+              <w:bottom w:val="single" w:sz="4" w:space="0" w:color="auto"/>
+              <w:right w:val="single" w:sz="4" w:space="0" w:color="auto"/>
+            </w:tcBorders>
+            <w:tcMar>
+              <w:left w:w="108" w:type="dxa"/>
+              <w:right w:w="108" w:type="dxa"/>
+            </w:tcMar>
+            <w:vAlign w:val="center"/>
+          </w:tcPr>
+          <w:p>
+            <w:pPr>
+              <w:jc w:val="center"/>
+            </w:pPr>
+            <w:r>
+              <w:rPr>
+                <w:rFonts w:ascii="Aptos Narrow" w:eastAsia="Aptos Narrow" w:hAnsi="Aptos Narrow" w:cs="Aptos Narrow"/>
+                <w:color w:val="000000" w:themeColor="text1"/>
+                <w:sz w:val="20"/>
+                <w:szCs w:val="20"/>
+              </w:rPr>
+              <w:t>17</w:t>
             </w:r>
           </w:p>
         </w:tc>
@@ -8550,31 +8598,31 @@
         </w:trPr>
         <w:tc>
           <w:tcPr>
-            <w:tcW w:w="833" w:type="dxa"/>
-            <w:tcBorders>
-              <w:top w:val="single" w:sz="4" w:space="0" w:color="auto"/>
-              <w:left w:val="single" w:sz="4" w:space="0" w:color="auto"/>
-              <w:bottom w:val="single" w:sz="4" w:space="0" w:color="auto"/>
-              <w:right w:val="single" w:sz="4" w:space="0" w:color="auto"/>
-            </w:tcBorders>
-            <w:tcMar>
-              <w:left w:w="108" w:type="dxa"/>
-              <w:right w:w="108" w:type="dxa"/>
-            </w:tcMar>
-          </w:tcPr>
-          <w:p>
-            <w:pPr>
-              <w:jc w:val="center"/>
-            </w:pPr>
-            <w:r>
-              <w:rPr>
-                <w:rFonts w:ascii="Aptos Narrow" w:eastAsia="Aptos Narrow" w:hAnsi="Aptos Narrow" w:cs="Aptos Narrow"/>
-                <w:color w:val="000000" w:themeColor="text1"/>
-                <w:sz w:val="20"/>
-                <w:szCs w:val="20"/>
-                <w:lang w:val="pl"/>
-              </w:rPr>
-              <w:t xml:space="preserve"> </w:t>
+            <w:tcW w:w="576" w:type="dxa"/>
+            <w:tcBorders>
+              <w:top w:val="single" w:sz="4" w:space="0" w:color="auto"/>
+              <w:left w:val="single" w:sz="4" w:space="0" w:color="auto"/>
+              <w:bottom w:val="single" w:sz="4" w:space="0" w:color="auto"/>
+              <w:right w:val="single" w:sz="4" w:space="0" w:color="auto"/>
+            </w:tcBorders>
+            <w:tcMar>
+              <w:left w:w="108" w:type="dxa"/>
+              <w:right w:w="108" w:type="dxa"/>
+            </w:tcMar>
+            <w:vAlign w:val="center"/>
+          </w:tcPr>
+          <w:p>
+            <w:pPr>
+              <w:jc w:val="center"/>
+            </w:pPr>
+            <w:r>
+              <w:rPr>
+                <w:rFonts w:ascii="Aptos Narrow" w:eastAsia="Aptos Narrow" w:hAnsi="Aptos Narrow" w:cs="Aptos Narrow"/>
+                <w:color w:val="000000" w:themeColor="text1"/>
+                <w:sz w:val="20"/>
+                <w:szCs w:val="20"/>
+              </w:rPr>
+              <w:t>18</w:t>
             </w:r>
           </w:p>
         </w:tc>
@@ -8951,7 +8999,7 @@
         </w:trPr>
         <w:tc>
           <w:tcPr>
-            <w:tcW w:w="833" w:type="dxa"/>
+            <w:tcW w:w="576" w:type="dxa"/>
             <w:tcBorders>
               <w:top w:val="single" w:sz="4" w:space="0" w:color="auto"/>
               <w:left w:val="single" w:sz="4" w:space="0" w:color="auto"/>
@@ -8978,7 +9026,7 @@
                 <w:szCs w:val="20"/>
                 <w:lang w:val="pl"/>
               </w:rPr>
-              <w:t>WYNIK</w:t>
+              <w:t>PKT</w:t>
             </w:r>
           </w:p>
         </w:tc>
@@ -9224,7 +9272,6 @@
                 <w:bCs/>
                 <w:lang w:val="pl"/>
               </w:rPr>
-              <w:lastRenderedPageBreak/>
               <w:t>Tor</w:t>
             </w:r>
           </w:p>
@@ -10141,7 +10188,7 @@
         <w:tblLook w:val="04A0" w:firstRow="1" w:lastRow="0" w:firstColumn="1" w:lastColumn="0" w:noHBand="0" w:noVBand="1"/>
       </w:tblPr>
       <w:tblGrid>
-        <w:gridCol w:w="855"/>
+        <w:gridCol w:w="576"/>
         <w:gridCol w:w="735"/>
         <w:gridCol w:w="735"/>
         <w:gridCol w:w="735"/>
@@ -10158,7 +10205,7 @@
         </w:trPr>
         <w:tc>
           <w:tcPr>
-            <w:tcW w:w="855" w:type="dxa"/>
+            <w:tcW w:w="576" w:type="dxa"/>
             <w:tcBorders>
               <w:top w:val="single" w:sz="4" w:space="0" w:color="auto"/>
               <w:left w:val="single" w:sz="4" w:space="0" w:color="auto"/>
@@ -10332,7 +10379,7 @@
         </w:trPr>
         <w:tc>
           <w:tcPr>
-            <w:tcW w:w="855" w:type="dxa"/>
+            <w:tcW w:w="576" w:type="dxa"/>
             <w:tcBorders>
               <w:top w:val="single" w:sz="4" w:space="0" w:color="auto"/>
               <w:left w:val="single" w:sz="4" w:space="0" w:color="auto"/>
@@ -10631,28 +10678,31 @@
         </w:trPr>
         <w:tc>
           <w:tcPr>
-            <w:tcW w:w="855" w:type="dxa"/>
-            <w:tcBorders>
-              <w:top w:val="single" w:sz="4" w:space="0" w:color="auto"/>
-              <w:left w:val="single" w:sz="4" w:space="0" w:color="auto"/>
-              <w:bottom w:val="single" w:sz="4" w:space="0" w:color="auto"/>
-              <w:right w:val="single" w:sz="4" w:space="0" w:color="auto"/>
-            </w:tcBorders>
-            <w:tcMar>
-              <w:left w:w="108" w:type="dxa"/>
-              <w:right w:w="108" w:type="dxa"/>
-            </w:tcMar>
-          </w:tcPr>
-          <w:p>
-            <w:r>
-              <w:rPr>
-                <w:rFonts w:ascii="Aptos Narrow" w:eastAsia="Aptos Narrow" w:hAnsi="Aptos Narrow" w:cs="Aptos Narrow"/>
-                <w:color w:val="000000" w:themeColor="text1"/>
-                <w:sz w:val="20"/>
-                <w:szCs w:val="20"/>
-                <w:lang w:val="pl"/>
-              </w:rPr>
-              <w:t xml:space="preserve"> </w:t>
+            <w:tcW w:w="576" w:type="dxa"/>
+            <w:tcBorders>
+              <w:top w:val="single" w:sz="4" w:space="0" w:color="auto"/>
+              <w:left w:val="single" w:sz="4" w:space="0" w:color="auto"/>
+              <w:bottom w:val="single" w:sz="4" w:space="0" w:color="auto"/>
+              <w:right w:val="single" w:sz="4" w:space="0" w:color="auto"/>
+            </w:tcBorders>
+            <w:tcMar>
+              <w:left w:w="108" w:type="dxa"/>
+              <w:right w:w="108" w:type="dxa"/>
+            </w:tcMar>
+            <w:vAlign w:val="center"/>
+          </w:tcPr>
+          <w:p>
+            <w:pPr>
+              <w:jc w:val="center"/>
+            </w:pPr>
+            <w:r>
+              <w:rPr>
+                <w:rFonts w:ascii="Aptos Narrow" w:eastAsia="Aptos Narrow" w:hAnsi="Aptos Narrow" w:cs="Aptos Narrow"/>
+                <w:color w:val="000000" w:themeColor="text1"/>
+                <w:sz w:val="20"/>
+                <w:szCs w:val="20"/>
+              </w:rPr>
+              <w:t>1</w:t>
             </w:r>
           </w:p>
         </w:tc>
@@ -10908,31 +10958,31 @@
         </w:trPr>
         <w:tc>
           <w:tcPr>
-            <w:tcW w:w="855" w:type="dxa"/>
-            <w:tcBorders>
-              <w:top w:val="single" w:sz="4" w:space="0" w:color="auto"/>
-              <w:left w:val="single" w:sz="4" w:space="0" w:color="auto"/>
-              <w:bottom w:val="single" w:sz="4" w:space="0" w:color="auto"/>
-              <w:right w:val="single" w:sz="4" w:space="0" w:color="auto"/>
-            </w:tcBorders>
-            <w:tcMar>
-              <w:left w:w="108" w:type="dxa"/>
-              <w:right w:w="108" w:type="dxa"/>
-            </w:tcMar>
-          </w:tcPr>
-          <w:p>
-            <w:pPr>
-              <w:jc w:val="center"/>
-            </w:pPr>
-            <w:r>
-              <w:rPr>
-                <w:rFonts w:ascii="Aptos Narrow" w:eastAsia="Aptos Narrow" w:hAnsi="Aptos Narrow" w:cs="Aptos Narrow"/>
-                <w:color w:val="000000" w:themeColor="text1"/>
-                <w:sz w:val="20"/>
-                <w:szCs w:val="20"/>
-                <w:lang w:val="pl"/>
-              </w:rPr>
-              <w:t xml:space="preserve"> </w:t>
+            <w:tcW w:w="576" w:type="dxa"/>
+            <w:tcBorders>
+              <w:top w:val="single" w:sz="4" w:space="0" w:color="auto"/>
+              <w:left w:val="single" w:sz="4" w:space="0" w:color="auto"/>
+              <w:bottom w:val="single" w:sz="4" w:space="0" w:color="auto"/>
+              <w:right w:val="single" w:sz="4" w:space="0" w:color="auto"/>
+            </w:tcBorders>
+            <w:tcMar>
+              <w:left w:w="108" w:type="dxa"/>
+              <w:right w:w="108" w:type="dxa"/>
+            </w:tcMar>
+            <w:vAlign w:val="center"/>
+          </w:tcPr>
+          <w:p>
+            <w:pPr>
+              <w:jc w:val="center"/>
+            </w:pPr>
+            <w:r>
+              <w:rPr>
+                <w:rFonts w:ascii="Aptos Narrow" w:eastAsia="Aptos Narrow" w:hAnsi="Aptos Narrow" w:cs="Aptos Narrow"/>
+                <w:color w:val="000000" w:themeColor="text1"/>
+                <w:sz w:val="20"/>
+                <w:szCs w:val="20"/>
+              </w:rPr>
+              <w:t>2</w:t>
             </w:r>
           </w:p>
         </w:tc>
@@ -11188,31 +11238,31 @@
         </w:trPr>
         <w:tc>
           <w:tcPr>
-            <w:tcW w:w="855" w:type="dxa"/>
-            <w:tcBorders>
-              <w:top w:val="single" w:sz="4" w:space="0" w:color="auto"/>
-              <w:left w:val="single" w:sz="4" w:space="0" w:color="auto"/>
-              <w:bottom w:val="single" w:sz="4" w:space="0" w:color="auto"/>
-              <w:right w:val="single" w:sz="4" w:space="0" w:color="auto"/>
-            </w:tcBorders>
-            <w:tcMar>
-              <w:left w:w="108" w:type="dxa"/>
-              <w:right w:w="108" w:type="dxa"/>
-            </w:tcMar>
-          </w:tcPr>
-          <w:p>
-            <w:pPr>
-              <w:jc w:val="center"/>
-            </w:pPr>
-            <w:r>
-              <w:rPr>
-                <w:rFonts w:ascii="Aptos Narrow" w:eastAsia="Aptos Narrow" w:hAnsi="Aptos Narrow" w:cs="Aptos Narrow"/>
-                <w:color w:val="000000" w:themeColor="text1"/>
-                <w:sz w:val="20"/>
-                <w:szCs w:val="20"/>
-                <w:lang w:val="pl"/>
-              </w:rPr>
-              <w:t xml:space="preserve"> </w:t>
+            <w:tcW w:w="576" w:type="dxa"/>
+            <w:tcBorders>
+              <w:top w:val="single" w:sz="4" w:space="0" w:color="auto"/>
+              <w:left w:val="single" w:sz="4" w:space="0" w:color="auto"/>
+              <w:bottom w:val="single" w:sz="4" w:space="0" w:color="auto"/>
+              <w:right w:val="single" w:sz="4" w:space="0" w:color="auto"/>
+            </w:tcBorders>
+            <w:tcMar>
+              <w:left w:w="108" w:type="dxa"/>
+              <w:right w:w="108" w:type="dxa"/>
+            </w:tcMar>
+            <w:vAlign w:val="center"/>
+          </w:tcPr>
+          <w:p>
+            <w:pPr>
+              <w:jc w:val="center"/>
+            </w:pPr>
+            <w:r>
+              <w:rPr>
+                <w:rFonts w:ascii="Aptos Narrow" w:eastAsia="Aptos Narrow" w:hAnsi="Aptos Narrow" w:cs="Aptos Narrow"/>
+                <w:color w:val="000000" w:themeColor="text1"/>
+                <w:sz w:val="20"/>
+                <w:szCs w:val="20"/>
+              </w:rPr>
+              <w:t>3</w:t>
             </w:r>
           </w:p>
         </w:tc>
@@ -11468,31 +11518,31 @@
         </w:trPr>
         <w:tc>
           <w:tcPr>
-            <w:tcW w:w="855" w:type="dxa"/>
-            <w:tcBorders>
-              <w:top w:val="single" w:sz="4" w:space="0" w:color="auto"/>
-              <w:left w:val="single" w:sz="4" w:space="0" w:color="auto"/>
-              <w:bottom w:val="single" w:sz="4" w:space="0" w:color="auto"/>
-              <w:right w:val="single" w:sz="4" w:space="0" w:color="auto"/>
-            </w:tcBorders>
-            <w:tcMar>
-              <w:left w:w="108" w:type="dxa"/>
-              <w:right w:w="108" w:type="dxa"/>
-            </w:tcMar>
-          </w:tcPr>
-          <w:p>
-            <w:pPr>
-              <w:jc w:val="center"/>
-            </w:pPr>
-            <w:r>
-              <w:rPr>
-                <w:rFonts w:ascii="Aptos Narrow" w:eastAsia="Aptos Narrow" w:hAnsi="Aptos Narrow" w:cs="Aptos Narrow"/>
-                <w:color w:val="000000" w:themeColor="text1"/>
-                <w:sz w:val="20"/>
-                <w:szCs w:val="20"/>
-                <w:lang w:val="pl"/>
-              </w:rPr>
-              <w:t xml:space="preserve"> </w:t>
+            <w:tcW w:w="576" w:type="dxa"/>
+            <w:tcBorders>
+              <w:top w:val="single" w:sz="4" w:space="0" w:color="auto"/>
+              <w:left w:val="single" w:sz="4" w:space="0" w:color="auto"/>
+              <w:bottom w:val="single" w:sz="4" w:space="0" w:color="auto"/>
+              <w:right w:val="single" w:sz="4" w:space="0" w:color="auto"/>
+            </w:tcBorders>
+            <w:tcMar>
+              <w:left w:w="108" w:type="dxa"/>
+              <w:right w:w="108" w:type="dxa"/>
+            </w:tcMar>
+            <w:vAlign w:val="center"/>
+          </w:tcPr>
+          <w:p>
+            <w:pPr>
+              <w:jc w:val="center"/>
+            </w:pPr>
+            <w:r>
+              <w:rPr>
+                <w:rFonts w:ascii="Aptos Narrow" w:eastAsia="Aptos Narrow" w:hAnsi="Aptos Narrow" w:cs="Aptos Narrow"/>
+                <w:color w:val="000000" w:themeColor="text1"/>
+                <w:sz w:val="20"/>
+                <w:szCs w:val="20"/>
+              </w:rPr>
+              <w:t>4</w:t>
             </w:r>
           </w:p>
         </w:tc>
@@ -11748,31 +11798,31 @@
         </w:trPr>
         <w:tc>
           <w:tcPr>
-            <w:tcW w:w="855" w:type="dxa"/>
-            <w:tcBorders>
-              <w:top w:val="single" w:sz="4" w:space="0" w:color="auto"/>
-              <w:left w:val="single" w:sz="4" w:space="0" w:color="auto"/>
-              <w:bottom w:val="single" w:sz="4" w:space="0" w:color="auto"/>
-              <w:right w:val="single" w:sz="4" w:space="0" w:color="auto"/>
-            </w:tcBorders>
-            <w:tcMar>
-              <w:left w:w="108" w:type="dxa"/>
-              <w:right w:w="108" w:type="dxa"/>
-            </w:tcMar>
-          </w:tcPr>
-          <w:p>
-            <w:pPr>
-              <w:jc w:val="center"/>
-            </w:pPr>
-            <w:r>
-              <w:rPr>
-                <w:rFonts w:ascii="Aptos Narrow" w:eastAsia="Aptos Narrow" w:hAnsi="Aptos Narrow" w:cs="Aptos Narrow"/>
-                <w:color w:val="000000" w:themeColor="text1"/>
-                <w:sz w:val="20"/>
-                <w:szCs w:val="20"/>
-                <w:lang w:val="pl"/>
-              </w:rPr>
-              <w:t xml:space="preserve"> </w:t>
+            <w:tcW w:w="576" w:type="dxa"/>
+            <w:tcBorders>
+              <w:top w:val="single" w:sz="4" w:space="0" w:color="auto"/>
+              <w:left w:val="single" w:sz="4" w:space="0" w:color="auto"/>
+              <w:bottom w:val="single" w:sz="4" w:space="0" w:color="auto"/>
+              <w:right w:val="single" w:sz="4" w:space="0" w:color="auto"/>
+            </w:tcBorders>
+            <w:tcMar>
+              <w:left w:w="108" w:type="dxa"/>
+              <w:right w:w="108" w:type="dxa"/>
+            </w:tcMar>
+            <w:vAlign w:val="center"/>
+          </w:tcPr>
+          <w:p>
+            <w:pPr>
+              <w:jc w:val="center"/>
+            </w:pPr>
+            <w:r>
+              <w:rPr>
+                <w:rFonts w:ascii="Aptos Narrow" w:eastAsia="Aptos Narrow" w:hAnsi="Aptos Narrow" w:cs="Aptos Narrow"/>
+                <w:color w:val="000000" w:themeColor="text1"/>
+                <w:sz w:val="20"/>
+                <w:szCs w:val="20"/>
+              </w:rPr>
+              <w:t>5</w:t>
             </w:r>
           </w:p>
         </w:tc>
@@ -12028,31 +12078,31 @@
         </w:trPr>
         <w:tc>
           <w:tcPr>
-            <w:tcW w:w="855" w:type="dxa"/>
-            <w:tcBorders>
-              <w:top w:val="single" w:sz="4" w:space="0" w:color="auto"/>
-              <w:left w:val="single" w:sz="4" w:space="0" w:color="auto"/>
-              <w:bottom w:val="single" w:sz="4" w:space="0" w:color="auto"/>
-              <w:right w:val="single" w:sz="4" w:space="0" w:color="auto"/>
-            </w:tcBorders>
-            <w:tcMar>
-              <w:left w:w="108" w:type="dxa"/>
-              <w:right w:w="108" w:type="dxa"/>
-            </w:tcMar>
-          </w:tcPr>
-          <w:p>
-            <w:pPr>
-              <w:jc w:val="center"/>
-            </w:pPr>
-            <w:r>
-              <w:rPr>
-                <w:rFonts w:ascii="Aptos Narrow" w:eastAsia="Aptos Narrow" w:hAnsi="Aptos Narrow" w:cs="Aptos Narrow"/>
-                <w:color w:val="000000" w:themeColor="text1"/>
-                <w:sz w:val="20"/>
-                <w:szCs w:val="20"/>
-                <w:lang w:val="pl"/>
-              </w:rPr>
-              <w:t xml:space="preserve"> </w:t>
+            <w:tcW w:w="576" w:type="dxa"/>
+            <w:tcBorders>
+              <w:top w:val="single" w:sz="4" w:space="0" w:color="auto"/>
+              <w:left w:val="single" w:sz="4" w:space="0" w:color="auto"/>
+              <w:bottom w:val="single" w:sz="4" w:space="0" w:color="auto"/>
+              <w:right w:val="single" w:sz="4" w:space="0" w:color="auto"/>
+            </w:tcBorders>
+            <w:tcMar>
+              <w:left w:w="108" w:type="dxa"/>
+              <w:right w:w="108" w:type="dxa"/>
+            </w:tcMar>
+            <w:vAlign w:val="center"/>
+          </w:tcPr>
+          <w:p>
+            <w:pPr>
+              <w:jc w:val="center"/>
+            </w:pPr>
+            <w:r>
+              <w:rPr>
+                <w:rFonts w:ascii="Aptos Narrow" w:eastAsia="Aptos Narrow" w:hAnsi="Aptos Narrow" w:cs="Aptos Narrow"/>
+                <w:color w:val="000000" w:themeColor="text1"/>
+                <w:sz w:val="20"/>
+                <w:szCs w:val="20"/>
+              </w:rPr>
+              <w:t>6</w:t>
             </w:r>
           </w:p>
         </w:tc>
@@ -12308,31 +12358,31 @@
         </w:trPr>
         <w:tc>
           <w:tcPr>
-            <w:tcW w:w="855" w:type="dxa"/>
-            <w:tcBorders>
-              <w:top w:val="single" w:sz="4" w:space="0" w:color="auto"/>
-              <w:left w:val="single" w:sz="4" w:space="0" w:color="auto"/>
-              <w:bottom w:val="single" w:sz="4" w:space="0" w:color="auto"/>
-              <w:right w:val="single" w:sz="4" w:space="0" w:color="auto"/>
-            </w:tcBorders>
-            <w:tcMar>
-              <w:left w:w="108" w:type="dxa"/>
-              <w:right w:w="108" w:type="dxa"/>
-            </w:tcMar>
-          </w:tcPr>
-          <w:p>
-            <w:pPr>
-              <w:jc w:val="center"/>
-            </w:pPr>
-            <w:r>
-              <w:rPr>
-                <w:rFonts w:ascii="Aptos Narrow" w:eastAsia="Aptos Narrow" w:hAnsi="Aptos Narrow" w:cs="Aptos Narrow"/>
-                <w:color w:val="000000" w:themeColor="text1"/>
-                <w:sz w:val="20"/>
-                <w:szCs w:val="20"/>
-                <w:lang w:val="pl"/>
-              </w:rPr>
-              <w:t xml:space="preserve"> </w:t>
+            <w:tcW w:w="576" w:type="dxa"/>
+            <w:tcBorders>
+              <w:top w:val="single" w:sz="4" w:space="0" w:color="auto"/>
+              <w:left w:val="single" w:sz="4" w:space="0" w:color="auto"/>
+              <w:bottom w:val="single" w:sz="4" w:space="0" w:color="auto"/>
+              <w:right w:val="single" w:sz="4" w:space="0" w:color="auto"/>
+            </w:tcBorders>
+            <w:tcMar>
+              <w:left w:w="108" w:type="dxa"/>
+              <w:right w:w="108" w:type="dxa"/>
+            </w:tcMar>
+            <w:vAlign w:val="center"/>
+          </w:tcPr>
+          <w:p>
+            <w:pPr>
+              <w:jc w:val="center"/>
+            </w:pPr>
+            <w:r>
+              <w:rPr>
+                <w:rFonts w:ascii="Aptos Narrow" w:eastAsia="Aptos Narrow" w:hAnsi="Aptos Narrow" w:cs="Aptos Narrow"/>
+                <w:color w:val="000000" w:themeColor="text1"/>
+                <w:sz w:val="20"/>
+                <w:szCs w:val="20"/>
+              </w:rPr>
+              <w:t>7</w:t>
             </w:r>
           </w:p>
         </w:tc>
@@ -12588,31 +12638,31 @@
         </w:trPr>
         <w:tc>
           <w:tcPr>
-            <w:tcW w:w="855" w:type="dxa"/>
-            <w:tcBorders>
-              <w:top w:val="single" w:sz="4" w:space="0" w:color="auto"/>
-              <w:left w:val="single" w:sz="4" w:space="0" w:color="auto"/>
-              <w:bottom w:val="single" w:sz="4" w:space="0" w:color="auto"/>
-              <w:right w:val="single" w:sz="4" w:space="0" w:color="auto"/>
-            </w:tcBorders>
-            <w:tcMar>
-              <w:left w:w="108" w:type="dxa"/>
-              <w:right w:w="108" w:type="dxa"/>
-            </w:tcMar>
-          </w:tcPr>
-          <w:p>
-            <w:pPr>
-              <w:jc w:val="center"/>
-            </w:pPr>
-            <w:r>
-              <w:rPr>
-                <w:rFonts w:ascii="Aptos Narrow" w:eastAsia="Aptos Narrow" w:hAnsi="Aptos Narrow" w:cs="Aptos Narrow"/>
-                <w:color w:val="000000" w:themeColor="text1"/>
-                <w:sz w:val="20"/>
-                <w:szCs w:val="20"/>
-                <w:lang w:val="pl"/>
-              </w:rPr>
-              <w:t xml:space="preserve"> </w:t>
+            <w:tcW w:w="576" w:type="dxa"/>
+            <w:tcBorders>
+              <w:top w:val="single" w:sz="4" w:space="0" w:color="auto"/>
+              <w:left w:val="single" w:sz="4" w:space="0" w:color="auto"/>
+              <w:bottom w:val="single" w:sz="4" w:space="0" w:color="auto"/>
+              <w:right w:val="single" w:sz="4" w:space="0" w:color="auto"/>
+            </w:tcBorders>
+            <w:tcMar>
+              <w:left w:w="108" w:type="dxa"/>
+              <w:right w:w="108" w:type="dxa"/>
+            </w:tcMar>
+            <w:vAlign w:val="center"/>
+          </w:tcPr>
+          <w:p>
+            <w:pPr>
+              <w:jc w:val="center"/>
+            </w:pPr>
+            <w:r>
+              <w:rPr>
+                <w:rFonts w:ascii="Aptos Narrow" w:eastAsia="Aptos Narrow" w:hAnsi="Aptos Narrow" w:cs="Aptos Narrow"/>
+                <w:color w:val="000000" w:themeColor="text1"/>
+                <w:sz w:val="20"/>
+                <w:szCs w:val="20"/>
+              </w:rPr>
+              <w:t>8</w:t>
             </w:r>
           </w:p>
         </w:tc>
@@ -12868,31 +12918,31 @@
         </w:trPr>
         <w:tc>
           <w:tcPr>
-            <w:tcW w:w="855" w:type="dxa"/>
-            <w:tcBorders>
-              <w:top w:val="single" w:sz="4" w:space="0" w:color="auto"/>
-              <w:left w:val="single" w:sz="4" w:space="0" w:color="auto"/>
-              <w:bottom w:val="single" w:sz="4" w:space="0" w:color="auto"/>
-              <w:right w:val="single" w:sz="4" w:space="0" w:color="auto"/>
-            </w:tcBorders>
-            <w:tcMar>
-              <w:left w:w="108" w:type="dxa"/>
-              <w:right w:w="108" w:type="dxa"/>
-            </w:tcMar>
-          </w:tcPr>
-          <w:p>
-            <w:pPr>
-              <w:jc w:val="center"/>
-            </w:pPr>
-            <w:r>
-              <w:rPr>
-                <w:rFonts w:ascii="Aptos Narrow" w:eastAsia="Aptos Narrow" w:hAnsi="Aptos Narrow" w:cs="Aptos Narrow"/>
-                <w:color w:val="000000" w:themeColor="text1"/>
-                <w:sz w:val="20"/>
-                <w:szCs w:val="20"/>
-                <w:lang w:val="pl"/>
-              </w:rPr>
-              <w:t xml:space="preserve"> </w:t>
+            <w:tcW w:w="576" w:type="dxa"/>
+            <w:tcBorders>
+              <w:top w:val="single" w:sz="4" w:space="0" w:color="auto"/>
+              <w:left w:val="single" w:sz="4" w:space="0" w:color="auto"/>
+              <w:bottom w:val="single" w:sz="4" w:space="0" w:color="auto"/>
+              <w:right w:val="single" w:sz="4" w:space="0" w:color="auto"/>
+            </w:tcBorders>
+            <w:tcMar>
+              <w:left w:w="108" w:type="dxa"/>
+              <w:right w:w="108" w:type="dxa"/>
+            </w:tcMar>
+            <w:vAlign w:val="center"/>
+          </w:tcPr>
+          <w:p>
+            <w:pPr>
+              <w:jc w:val="center"/>
+            </w:pPr>
+            <w:r>
+              <w:rPr>
+                <w:rFonts w:ascii="Aptos Narrow" w:eastAsia="Aptos Narrow" w:hAnsi="Aptos Narrow" w:cs="Aptos Narrow"/>
+                <w:color w:val="000000" w:themeColor="text1"/>
+                <w:sz w:val="20"/>
+                <w:szCs w:val="20"/>
+              </w:rPr>
+              <w:t>9</w:t>
             </w:r>
           </w:p>
         </w:tc>
@@ -13148,31 +13198,31 @@
         </w:trPr>
         <w:tc>
           <w:tcPr>
-            <w:tcW w:w="855" w:type="dxa"/>
-            <w:tcBorders>
-              <w:top w:val="single" w:sz="4" w:space="0" w:color="auto"/>
-              <w:left w:val="single" w:sz="4" w:space="0" w:color="auto"/>
-              <w:bottom w:val="single" w:sz="4" w:space="0" w:color="auto"/>
-              <w:right w:val="single" w:sz="4" w:space="0" w:color="auto"/>
-            </w:tcBorders>
-            <w:tcMar>
-              <w:left w:w="108" w:type="dxa"/>
-              <w:right w:w="108" w:type="dxa"/>
-            </w:tcMar>
-          </w:tcPr>
-          <w:p>
-            <w:pPr>
-              <w:jc w:val="center"/>
-            </w:pPr>
-            <w:r>
-              <w:rPr>
-                <w:rFonts w:ascii="Aptos Narrow" w:eastAsia="Aptos Narrow" w:hAnsi="Aptos Narrow" w:cs="Aptos Narrow"/>
-                <w:color w:val="000000" w:themeColor="text1"/>
-                <w:sz w:val="20"/>
-                <w:szCs w:val="20"/>
-                <w:lang w:val="pl"/>
-              </w:rPr>
-              <w:t xml:space="preserve"> </w:t>
+            <w:tcW w:w="576" w:type="dxa"/>
+            <w:tcBorders>
+              <w:top w:val="single" w:sz="4" w:space="0" w:color="auto"/>
+              <w:left w:val="single" w:sz="4" w:space="0" w:color="auto"/>
+              <w:bottom w:val="single" w:sz="4" w:space="0" w:color="auto"/>
+              <w:right w:val="single" w:sz="4" w:space="0" w:color="auto"/>
+            </w:tcBorders>
+            <w:tcMar>
+              <w:left w:w="108" w:type="dxa"/>
+              <w:right w:w="108" w:type="dxa"/>
+            </w:tcMar>
+            <w:vAlign w:val="center"/>
+          </w:tcPr>
+          <w:p>
+            <w:pPr>
+              <w:jc w:val="center"/>
+            </w:pPr>
+            <w:r>
+              <w:rPr>
+                <w:rFonts w:ascii="Aptos Narrow" w:eastAsia="Aptos Narrow" w:hAnsi="Aptos Narrow" w:cs="Aptos Narrow"/>
+                <w:color w:val="000000" w:themeColor="text1"/>
+                <w:sz w:val="20"/>
+                <w:szCs w:val="20"/>
+              </w:rPr>
+              <w:t>10</w:t>
             </w:r>
           </w:p>
         </w:tc>
@@ -13428,31 +13478,31 @@
         </w:trPr>
         <w:tc>
           <w:tcPr>
-            <w:tcW w:w="855" w:type="dxa"/>
-            <w:tcBorders>
-              <w:top w:val="single" w:sz="4" w:space="0" w:color="auto"/>
-              <w:left w:val="single" w:sz="4" w:space="0" w:color="auto"/>
-              <w:bottom w:val="single" w:sz="4" w:space="0" w:color="auto"/>
-              <w:right w:val="single" w:sz="4" w:space="0" w:color="auto"/>
-            </w:tcBorders>
-            <w:tcMar>
-              <w:left w:w="108" w:type="dxa"/>
-              <w:right w:w="108" w:type="dxa"/>
-            </w:tcMar>
-          </w:tcPr>
-          <w:p>
-            <w:pPr>
-              <w:jc w:val="center"/>
-            </w:pPr>
-            <w:r>
-              <w:rPr>
-                <w:rFonts w:ascii="Aptos Narrow" w:eastAsia="Aptos Narrow" w:hAnsi="Aptos Narrow" w:cs="Aptos Narrow"/>
-                <w:color w:val="000000" w:themeColor="text1"/>
-                <w:sz w:val="20"/>
-                <w:szCs w:val="20"/>
-                <w:lang w:val="pl"/>
-              </w:rPr>
-              <w:t xml:space="preserve"> </w:t>
+            <w:tcW w:w="576" w:type="dxa"/>
+            <w:tcBorders>
+              <w:top w:val="single" w:sz="4" w:space="0" w:color="auto"/>
+              <w:left w:val="single" w:sz="4" w:space="0" w:color="auto"/>
+              <w:bottom w:val="single" w:sz="4" w:space="0" w:color="auto"/>
+              <w:right w:val="single" w:sz="4" w:space="0" w:color="auto"/>
+            </w:tcBorders>
+            <w:tcMar>
+              <w:left w:w="108" w:type="dxa"/>
+              <w:right w:w="108" w:type="dxa"/>
+            </w:tcMar>
+            <w:vAlign w:val="center"/>
+          </w:tcPr>
+          <w:p>
+            <w:pPr>
+              <w:jc w:val="center"/>
+            </w:pPr>
+            <w:r>
+              <w:rPr>
+                <w:rFonts w:ascii="Aptos Narrow" w:eastAsia="Aptos Narrow" w:hAnsi="Aptos Narrow" w:cs="Aptos Narrow"/>
+                <w:color w:val="000000" w:themeColor="text1"/>
+                <w:sz w:val="20"/>
+                <w:szCs w:val="20"/>
+              </w:rPr>
+              <w:t>11</w:t>
             </w:r>
           </w:p>
         </w:tc>
@@ -13708,31 +13758,31 @@
         </w:trPr>
         <w:tc>
           <w:tcPr>
-            <w:tcW w:w="855" w:type="dxa"/>
-            <w:tcBorders>
-              <w:top w:val="single" w:sz="4" w:space="0" w:color="auto"/>
-              <w:left w:val="single" w:sz="4" w:space="0" w:color="auto"/>
-              <w:bottom w:val="single" w:sz="4" w:space="0" w:color="auto"/>
-              <w:right w:val="single" w:sz="4" w:space="0" w:color="auto"/>
-            </w:tcBorders>
-            <w:tcMar>
-              <w:left w:w="108" w:type="dxa"/>
-              <w:right w:w="108" w:type="dxa"/>
-            </w:tcMar>
-          </w:tcPr>
-          <w:p>
-            <w:pPr>
-              <w:jc w:val="center"/>
-            </w:pPr>
-            <w:r>
-              <w:rPr>
-                <w:rFonts w:ascii="Aptos Narrow" w:eastAsia="Aptos Narrow" w:hAnsi="Aptos Narrow" w:cs="Aptos Narrow"/>
-                <w:color w:val="000000" w:themeColor="text1"/>
-                <w:sz w:val="20"/>
-                <w:szCs w:val="20"/>
-                <w:lang w:val="pl"/>
-              </w:rPr>
-              <w:t xml:space="preserve"> </w:t>
+            <w:tcW w:w="576" w:type="dxa"/>
+            <w:tcBorders>
+              <w:top w:val="single" w:sz="4" w:space="0" w:color="auto"/>
+              <w:left w:val="single" w:sz="4" w:space="0" w:color="auto"/>
+              <w:bottom w:val="single" w:sz="4" w:space="0" w:color="auto"/>
+              <w:right w:val="single" w:sz="4" w:space="0" w:color="auto"/>
+            </w:tcBorders>
+            <w:tcMar>
+              <w:left w:w="108" w:type="dxa"/>
+              <w:right w:w="108" w:type="dxa"/>
+            </w:tcMar>
+            <w:vAlign w:val="center"/>
+          </w:tcPr>
+          <w:p>
+            <w:pPr>
+              <w:jc w:val="center"/>
+            </w:pPr>
+            <w:r>
+              <w:rPr>
+                <w:rFonts w:ascii="Aptos Narrow" w:eastAsia="Aptos Narrow" w:hAnsi="Aptos Narrow" w:cs="Aptos Narrow"/>
+                <w:color w:val="000000" w:themeColor="text1"/>
+                <w:sz w:val="20"/>
+                <w:szCs w:val="20"/>
+              </w:rPr>
+              <w:t>12</w:t>
             </w:r>
           </w:p>
         </w:tc>
@@ -13988,31 +14038,31 @@
         </w:trPr>
         <w:tc>
           <w:tcPr>
-            <w:tcW w:w="855" w:type="dxa"/>
-            <w:tcBorders>
-              <w:top w:val="single" w:sz="4" w:space="0" w:color="auto"/>
-              <w:left w:val="single" w:sz="4" w:space="0" w:color="auto"/>
-              <w:bottom w:val="single" w:sz="4" w:space="0" w:color="auto"/>
-              <w:right w:val="single" w:sz="4" w:space="0" w:color="auto"/>
-            </w:tcBorders>
-            <w:tcMar>
-              <w:left w:w="108" w:type="dxa"/>
-              <w:right w:w="108" w:type="dxa"/>
-            </w:tcMar>
-          </w:tcPr>
-          <w:p>
-            <w:pPr>
-              <w:jc w:val="center"/>
-            </w:pPr>
-            <w:r>
-              <w:rPr>
-                <w:rFonts w:ascii="Aptos Narrow" w:eastAsia="Aptos Narrow" w:hAnsi="Aptos Narrow" w:cs="Aptos Narrow"/>
-                <w:color w:val="000000" w:themeColor="text1"/>
-                <w:sz w:val="20"/>
-                <w:szCs w:val="20"/>
-                <w:lang w:val="pl"/>
-              </w:rPr>
-              <w:t xml:space="preserve"> </w:t>
+            <w:tcW w:w="576" w:type="dxa"/>
+            <w:tcBorders>
+              <w:top w:val="single" w:sz="4" w:space="0" w:color="auto"/>
+              <w:left w:val="single" w:sz="4" w:space="0" w:color="auto"/>
+              <w:bottom w:val="single" w:sz="4" w:space="0" w:color="auto"/>
+              <w:right w:val="single" w:sz="4" w:space="0" w:color="auto"/>
+            </w:tcBorders>
+            <w:tcMar>
+              <w:left w:w="108" w:type="dxa"/>
+              <w:right w:w="108" w:type="dxa"/>
+            </w:tcMar>
+            <w:vAlign w:val="center"/>
+          </w:tcPr>
+          <w:p>
+            <w:pPr>
+              <w:jc w:val="center"/>
+            </w:pPr>
+            <w:r>
+              <w:rPr>
+                <w:rFonts w:ascii="Aptos Narrow" w:eastAsia="Aptos Narrow" w:hAnsi="Aptos Narrow" w:cs="Aptos Narrow"/>
+                <w:color w:val="000000" w:themeColor="text1"/>
+                <w:sz w:val="20"/>
+                <w:szCs w:val="20"/>
+              </w:rPr>
+              <w:t>13</w:t>
             </w:r>
           </w:p>
         </w:tc>
@@ -14268,31 +14318,31 @@
         </w:trPr>
         <w:tc>
           <w:tcPr>
-            <w:tcW w:w="855" w:type="dxa"/>
-            <w:tcBorders>
-              <w:top w:val="single" w:sz="4" w:space="0" w:color="auto"/>
-              <w:left w:val="single" w:sz="4" w:space="0" w:color="auto"/>
-              <w:bottom w:val="single" w:sz="4" w:space="0" w:color="auto"/>
-              <w:right w:val="single" w:sz="4" w:space="0" w:color="auto"/>
-            </w:tcBorders>
-            <w:tcMar>
-              <w:left w:w="108" w:type="dxa"/>
-              <w:right w:w="108" w:type="dxa"/>
-            </w:tcMar>
-          </w:tcPr>
-          <w:p>
-            <w:pPr>
-              <w:jc w:val="center"/>
-            </w:pPr>
-            <w:r>
-              <w:rPr>
-                <w:rFonts w:ascii="Aptos Narrow" w:eastAsia="Aptos Narrow" w:hAnsi="Aptos Narrow" w:cs="Aptos Narrow"/>
-                <w:color w:val="000000" w:themeColor="text1"/>
-                <w:sz w:val="20"/>
-                <w:szCs w:val="20"/>
-                <w:lang w:val="pl"/>
-              </w:rPr>
-              <w:t xml:space="preserve"> </w:t>
+            <w:tcW w:w="576" w:type="dxa"/>
+            <w:tcBorders>
+              <w:top w:val="single" w:sz="4" w:space="0" w:color="auto"/>
+              <w:left w:val="single" w:sz="4" w:space="0" w:color="auto"/>
+              <w:bottom w:val="single" w:sz="4" w:space="0" w:color="auto"/>
+              <w:right w:val="single" w:sz="4" w:space="0" w:color="auto"/>
+            </w:tcBorders>
+            <w:tcMar>
+              <w:left w:w="108" w:type="dxa"/>
+              <w:right w:w="108" w:type="dxa"/>
+            </w:tcMar>
+            <w:vAlign w:val="center"/>
+          </w:tcPr>
+          <w:p>
+            <w:pPr>
+              <w:jc w:val="center"/>
+            </w:pPr>
+            <w:r>
+              <w:rPr>
+                <w:rFonts w:ascii="Aptos Narrow" w:eastAsia="Aptos Narrow" w:hAnsi="Aptos Narrow" w:cs="Aptos Narrow"/>
+                <w:color w:val="000000" w:themeColor="text1"/>
+                <w:sz w:val="20"/>
+                <w:szCs w:val="20"/>
+              </w:rPr>
+              <w:t>14</w:t>
             </w:r>
           </w:p>
         </w:tc>
@@ -14548,31 +14598,31 @@
         </w:trPr>
         <w:tc>
           <w:tcPr>
-            <w:tcW w:w="855" w:type="dxa"/>
-            <w:tcBorders>
-              <w:top w:val="single" w:sz="4" w:space="0" w:color="auto"/>
-              <w:left w:val="single" w:sz="4" w:space="0" w:color="auto"/>
-              <w:bottom w:val="single" w:sz="4" w:space="0" w:color="auto"/>
-              <w:right w:val="single" w:sz="4" w:space="0" w:color="auto"/>
-            </w:tcBorders>
-            <w:tcMar>
-              <w:left w:w="108" w:type="dxa"/>
-              <w:right w:w="108" w:type="dxa"/>
-            </w:tcMar>
-          </w:tcPr>
-          <w:p>
-            <w:pPr>
-              <w:jc w:val="center"/>
-            </w:pPr>
-            <w:r>
-              <w:rPr>
-                <w:rFonts w:ascii="Aptos Narrow" w:eastAsia="Aptos Narrow" w:hAnsi="Aptos Narrow" w:cs="Aptos Narrow"/>
-                <w:color w:val="000000" w:themeColor="text1"/>
-                <w:sz w:val="20"/>
-                <w:szCs w:val="20"/>
-                <w:lang w:val="pl"/>
-              </w:rPr>
-              <w:t xml:space="preserve"> </w:t>
+            <w:tcW w:w="576" w:type="dxa"/>
+            <w:tcBorders>
+              <w:top w:val="single" w:sz="4" w:space="0" w:color="auto"/>
+              <w:left w:val="single" w:sz="4" w:space="0" w:color="auto"/>
+              <w:bottom w:val="single" w:sz="4" w:space="0" w:color="auto"/>
+              <w:right w:val="single" w:sz="4" w:space="0" w:color="auto"/>
+            </w:tcBorders>
+            <w:tcMar>
+              <w:left w:w="108" w:type="dxa"/>
+              <w:right w:w="108" w:type="dxa"/>
+            </w:tcMar>
+            <w:vAlign w:val="center"/>
+          </w:tcPr>
+          <w:p>
+            <w:pPr>
+              <w:jc w:val="center"/>
+            </w:pPr>
+            <w:r>
+              <w:rPr>
+                <w:rFonts w:ascii="Aptos Narrow" w:eastAsia="Aptos Narrow" w:hAnsi="Aptos Narrow" w:cs="Aptos Narrow"/>
+                <w:color w:val="000000" w:themeColor="text1"/>
+                <w:sz w:val="20"/>
+                <w:szCs w:val="20"/>
+              </w:rPr>
+              <w:t>15</w:t>
             </w:r>
           </w:p>
         </w:tc>
@@ -14828,31 +14878,31 @@
         </w:trPr>
         <w:tc>
           <w:tcPr>
-            <w:tcW w:w="855" w:type="dxa"/>
-            <w:tcBorders>
-              <w:top w:val="single" w:sz="4" w:space="0" w:color="auto"/>
-              <w:left w:val="single" w:sz="4" w:space="0" w:color="auto"/>
-              <w:bottom w:val="single" w:sz="4" w:space="0" w:color="auto"/>
-              <w:right w:val="single" w:sz="4" w:space="0" w:color="auto"/>
-            </w:tcBorders>
-            <w:tcMar>
-              <w:left w:w="108" w:type="dxa"/>
-              <w:right w:w="108" w:type="dxa"/>
-            </w:tcMar>
-          </w:tcPr>
-          <w:p>
-            <w:pPr>
-              <w:jc w:val="center"/>
-            </w:pPr>
-            <w:r>
-              <w:rPr>
-                <w:rFonts w:ascii="Aptos Narrow" w:eastAsia="Aptos Narrow" w:hAnsi="Aptos Narrow" w:cs="Aptos Narrow"/>
-                <w:color w:val="000000" w:themeColor="text1"/>
-                <w:sz w:val="20"/>
-                <w:szCs w:val="20"/>
-                <w:lang w:val="pl"/>
-              </w:rPr>
-              <w:t xml:space="preserve"> </w:t>
+            <w:tcW w:w="576" w:type="dxa"/>
+            <w:tcBorders>
+              <w:top w:val="single" w:sz="4" w:space="0" w:color="auto"/>
+              <w:left w:val="single" w:sz="4" w:space="0" w:color="auto"/>
+              <w:bottom w:val="single" w:sz="4" w:space="0" w:color="auto"/>
+              <w:right w:val="single" w:sz="4" w:space="0" w:color="auto"/>
+            </w:tcBorders>
+            <w:tcMar>
+              <w:left w:w="108" w:type="dxa"/>
+              <w:right w:w="108" w:type="dxa"/>
+            </w:tcMar>
+            <w:vAlign w:val="center"/>
+          </w:tcPr>
+          <w:p>
+            <w:pPr>
+              <w:jc w:val="center"/>
+            </w:pPr>
+            <w:r>
+              <w:rPr>
+                <w:rFonts w:ascii="Aptos Narrow" w:eastAsia="Aptos Narrow" w:hAnsi="Aptos Narrow" w:cs="Aptos Narrow"/>
+                <w:color w:val="000000" w:themeColor="text1"/>
+                <w:sz w:val="20"/>
+                <w:szCs w:val="20"/>
+              </w:rPr>
+              <w:t>16</w:t>
             </w:r>
           </w:p>
         </w:tc>
@@ -15108,31 +15158,31 @@
         </w:trPr>
         <w:tc>
           <w:tcPr>
-            <w:tcW w:w="855" w:type="dxa"/>
-            <w:tcBorders>
-              <w:top w:val="single" w:sz="4" w:space="0" w:color="auto"/>
-              <w:left w:val="single" w:sz="4" w:space="0" w:color="auto"/>
-              <w:bottom w:val="single" w:sz="4" w:space="0" w:color="auto"/>
-              <w:right w:val="single" w:sz="4" w:space="0" w:color="auto"/>
-            </w:tcBorders>
-            <w:tcMar>
-              <w:left w:w="108" w:type="dxa"/>
-              <w:right w:w="108" w:type="dxa"/>
-            </w:tcMar>
-          </w:tcPr>
-          <w:p>
-            <w:pPr>
-              <w:jc w:val="center"/>
-            </w:pPr>
-            <w:r>
-              <w:rPr>
-                <w:rFonts w:ascii="Aptos Narrow" w:eastAsia="Aptos Narrow" w:hAnsi="Aptos Narrow" w:cs="Aptos Narrow"/>
-                <w:color w:val="000000" w:themeColor="text1"/>
-                <w:sz w:val="20"/>
-                <w:szCs w:val="20"/>
-                <w:lang w:val="pl"/>
-              </w:rPr>
-              <w:t xml:space="preserve"> </w:t>
+            <w:tcW w:w="576" w:type="dxa"/>
+            <w:tcBorders>
+              <w:top w:val="single" w:sz="4" w:space="0" w:color="auto"/>
+              <w:left w:val="single" w:sz="4" w:space="0" w:color="auto"/>
+              <w:bottom w:val="single" w:sz="4" w:space="0" w:color="auto"/>
+              <w:right w:val="single" w:sz="4" w:space="0" w:color="auto"/>
+            </w:tcBorders>
+            <w:tcMar>
+              <w:left w:w="108" w:type="dxa"/>
+              <w:right w:w="108" w:type="dxa"/>
+            </w:tcMar>
+            <w:vAlign w:val="center"/>
+          </w:tcPr>
+          <w:p>
+            <w:pPr>
+              <w:jc w:val="center"/>
+            </w:pPr>
+            <w:r>
+              <w:rPr>
+                <w:rFonts w:ascii="Aptos Narrow" w:eastAsia="Aptos Narrow" w:hAnsi="Aptos Narrow" w:cs="Aptos Narrow"/>
+                <w:color w:val="000000" w:themeColor="text1"/>
+                <w:sz w:val="20"/>
+                <w:szCs w:val="20"/>
+              </w:rPr>
+              <w:t>17</w:t>
             </w:r>
           </w:p>
         </w:tc>
@@ -15388,31 +15438,31 @@
         </w:trPr>
         <w:tc>
           <w:tcPr>
-            <w:tcW w:w="855" w:type="dxa"/>
-            <w:tcBorders>
-              <w:top w:val="single" w:sz="4" w:space="0" w:color="auto"/>
-              <w:left w:val="single" w:sz="4" w:space="0" w:color="auto"/>
-              <w:bottom w:val="single" w:sz="4" w:space="0" w:color="auto"/>
-              <w:right w:val="single" w:sz="4" w:space="0" w:color="auto"/>
-            </w:tcBorders>
-            <w:tcMar>
-              <w:left w:w="108" w:type="dxa"/>
-              <w:right w:w="108" w:type="dxa"/>
-            </w:tcMar>
-          </w:tcPr>
-          <w:p>
-            <w:pPr>
-              <w:jc w:val="center"/>
-            </w:pPr>
-            <w:r>
-              <w:rPr>
-                <w:rFonts w:ascii="Aptos Narrow" w:eastAsia="Aptos Narrow" w:hAnsi="Aptos Narrow" w:cs="Aptos Narrow"/>
-                <w:color w:val="000000" w:themeColor="text1"/>
-                <w:sz w:val="20"/>
-                <w:szCs w:val="20"/>
-                <w:lang w:val="pl"/>
-              </w:rPr>
-              <w:t xml:space="preserve"> </w:t>
+            <w:tcW w:w="576" w:type="dxa"/>
+            <w:tcBorders>
+              <w:top w:val="single" w:sz="4" w:space="0" w:color="auto"/>
+              <w:left w:val="single" w:sz="4" w:space="0" w:color="auto"/>
+              <w:bottom w:val="single" w:sz="4" w:space="0" w:color="auto"/>
+              <w:right w:val="single" w:sz="4" w:space="0" w:color="auto"/>
+            </w:tcBorders>
+            <w:tcMar>
+              <w:left w:w="108" w:type="dxa"/>
+              <w:right w:w="108" w:type="dxa"/>
+            </w:tcMar>
+            <w:vAlign w:val="center"/>
+          </w:tcPr>
+          <w:p>
+            <w:pPr>
+              <w:jc w:val="center"/>
+            </w:pPr>
+            <w:r>
+              <w:rPr>
+                <w:rFonts w:ascii="Aptos Narrow" w:eastAsia="Aptos Narrow" w:hAnsi="Aptos Narrow" w:cs="Aptos Narrow"/>
+                <w:color w:val="000000" w:themeColor="text1"/>
+                <w:sz w:val="20"/>
+                <w:szCs w:val="20"/>
+              </w:rPr>
+              <w:t>18</w:t>
             </w:r>
           </w:p>
         </w:tc>
@@ -15668,7 +15718,7 @@
         </w:trPr>
         <w:tc>
           <w:tcPr>
-            <w:tcW w:w="855" w:type="dxa"/>
+            <w:tcW w:w="576" w:type="dxa"/>
             <w:tcBorders>
               <w:top w:val="single" w:sz="4" w:space="0" w:color="auto"/>
               <w:left w:val="single" w:sz="4" w:space="0" w:color="auto"/>
@@ -15695,7 +15745,7 @@
                 <w:szCs w:val="20"/>
                 <w:lang w:val="pl"/>
               </w:rPr>
-              <w:t>WYNIK</w:t>
+              <w:t>PKT</w:t>
             </w:r>
           </w:p>
         </w:tc>
@@ -16569,17 +16619,6 @@
 </file>
 
 <file path=customXml/item1.xml><?xml version="1.0" encoding="utf-8"?>
-<p:properties xmlns:p="http://schemas.microsoft.com/office/2006/metadata/properties" xmlns:xsi="http://www.w3.org/2001/XMLSchema-instance" xmlns:pc="http://schemas.microsoft.com/office/infopath/2007/PartnerControls">
-  <documentManagement>
-    <TaxCatchAll xmlns="6e3c809f-d77f-4965-8c59-52bc5988e08d" xsi:nil="true"/>
-    <lcf76f155ced4ddcb4097134ff3c332f xmlns="6011e175-94d7-470b-a25b-96e606435ba7">
-      <Terms xmlns="http://schemas.microsoft.com/office/infopath/2007/PartnerControls"/>
-    </lcf76f155ced4ddcb4097134ff3c332f>
-  </documentManagement>
-</p:properties>
-</file>
-
-<file path=customXml/item2.xml><?xml version="1.0" encoding="utf-8"?>
 <?mso-contentType ?>
 <FormTemplates xmlns="http://schemas.microsoft.com/sharepoint/v3/contenttype/forms">
   <Display>DocumentLibraryForm</Display>
@@ -16588,7 +16627,7 @@
 </FormTemplates>
 </file>
 
-<file path=customXml/item3.xml><?xml version="1.0" encoding="utf-8"?>
+<file path=customXml/item2.xml><?xml version="1.0" encoding="utf-8"?>
 <ct:contentTypeSchema xmlns:ct="http://schemas.microsoft.com/office/2006/metadata/contentType" xmlns:ma="http://schemas.microsoft.com/office/2006/metadata/properties/metaAttributes" ct:_="" ma:_="" ma:contentTypeName="Dokument" ma:contentTypeID="0x010100E02B0782D6F96B44A7C1A6483B3F88A5" ma:contentTypeVersion="10" ma:contentTypeDescription="Utwórz nowy dokument." ma:contentTypeScope="" ma:versionID="dafbd3aba1efe586ac978fd8b8b0afe5">
   <xsd:schema xmlns:xsd="http://www.w3.org/2001/XMLSchema" xmlns:xs="http://www.w3.org/2001/XMLSchema" xmlns:p="http://schemas.microsoft.com/office/2006/metadata/properties" xmlns:ns2="6011e175-94d7-470b-a25b-96e606435ba7" xmlns:ns3="6e3c809f-d77f-4965-8c59-52bc5988e08d" targetNamespace="http://schemas.microsoft.com/office/2006/metadata/properties" ma:root="true" ma:fieldsID="632b28c003267633fc74dc71523c1969" ns2:_="" ns3:_="">
     <xsd:import namespace="6011e175-94d7-470b-a25b-96e606435ba7"/>
@@ -16777,24 +16816,18 @@
 </ct:contentTypeSchema>
 </file>
 
-<file path=customXml/itemProps1.xml><?xml version="1.0" encoding="utf-8"?>
-<ds:datastoreItem xmlns:ds="http://schemas.openxmlformats.org/officeDocument/2006/customXml" ds:itemID="{F05BD065-0207-4F18-A561-8170BF1FF0CA}">
-  <ds:schemaRefs>
-    <ds:schemaRef ds:uri="6011e175-94d7-470b-a25b-96e606435ba7"/>
-    <ds:schemaRef ds:uri="http://purl.org/dc/terms/"/>
-    <ds:schemaRef ds:uri="http://schemas.microsoft.com/office/2006/documentManagement/types"/>
-    <ds:schemaRef ds:uri="http://schemas.microsoft.com/office/2006/metadata/properties"/>
-    <ds:schemaRef ds:uri="http://purl.org/dc/elements/1.1/"/>
-    <ds:schemaRef ds:uri="6e3c809f-d77f-4965-8c59-52bc5988e08d"/>
-    <ds:schemaRef ds:uri="http://purl.org/dc/dcmitype/"/>
-    <ds:schemaRef ds:uri="http://schemas.microsoft.com/office/infopath/2007/PartnerControls"/>
-    <ds:schemaRef ds:uri="http://schemas.openxmlformats.org/package/2006/metadata/core-properties"/>
-    <ds:schemaRef ds:uri="http://www.w3.org/XML/1998/namespace"/>
-  </ds:schemaRefs>
-</ds:datastoreItem>
+<file path=customXml/item3.xml><?xml version="1.0" encoding="utf-8"?>
+<p:properties xmlns:p="http://schemas.microsoft.com/office/2006/metadata/properties" xmlns:xsi="http://www.w3.org/2001/XMLSchema-instance" xmlns:pc="http://schemas.microsoft.com/office/infopath/2007/PartnerControls">
+  <documentManagement>
+    <TaxCatchAll xmlns="6e3c809f-d77f-4965-8c59-52bc5988e08d" xsi:nil="true"/>
+    <lcf76f155ced4ddcb4097134ff3c332f xmlns="6011e175-94d7-470b-a25b-96e606435ba7">
+      <Terms xmlns="http://schemas.microsoft.com/office/infopath/2007/PartnerControls"/>
+    </lcf76f155ced4ddcb4097134ff3c332f>
+  </documentManagement>
+</p:properties>
 </file>
 
-<file path=customXml/itemProps2.xml><?xml version="1.0" encoding="utf-8"?>
+<file path=customXml/itemProps1.xml><?xml version="1.0" encoding="utf-8"?>
 <ds:datastoreItem xmlns:ds="http://schemas.openxmlformats.org/officeDocument/2006/customXml" ds:itemID="{6A802E19-EF36-445D-9103-1CF66682A738}">
   <ds:schemaRefs>
     <ds:schemaRef ds:uri="http://schemas.microsoft.com/sharepoint/v3/contenttype/forms"/>
@@ -16802,7 +16835,7 @@
 </ds:datastoreItem>
 </file>
 
-<file path=customXml/itemProps3.xml><?xml version="1.0" encoding="utf-8"?>
+<file path=customXml/itemProps2.xml><?xml version="1.0" encoding="utf-8"?>
 <ds:datastoreItem xmlns:ds="http://schemas.openxmlformats.org/officeDocument/2006/customXml" ds:itemID="{74ACB354-4589-4E2C-8EB9-D1A3D326D444}">
   <ds:schemaRefs>
     <ds:schemaRef ds:uri="http://schemas.microsoft.com/office/2006/metadata/contentType"/>
@@ -16819,4 +16852,15 @@
     <ds:schemaRef ds:uri="http://schemas.microsoft.com/internal/obd"/>
   </ds:schemaRefs>
 </ds:datastoreItem>
+</file>
+
+<file path=customXml/itemProps3.xml><?xml version="1.0" encoding="utf-8"?>
+<ds:datastoreItem xmlns:ds="http://schemas.openxmlformats.org/officeDocument/2006/customXml" ds:itemID="{F05BD065-0207-4F18-A561-8170BF1FF0CA}">
+  <ds:schemaRefs>
+    <ds:schemaRef ds:uri="http://schemas.microsoft.com/office/2006/metadata/properties"/>
+    <ds:schemaRef ds:uri="http://schemas.microsoft.com/office/infopath/2007/PartnerControls"/>
+    <ds:schemaRef ds:uri="6e3c809f-d77f-4965-8c59-52bc5988e08d"/>
+    <ds:schemaRef ds:uri="6011e175-94d7-470b-a25b-96e606435ba7"/>
+  </ds:schemaRefs>
+</ds:datastoreItem>
 </file>
</xml_diff>